<commit_message>
various cleanups and fixes
</commit_message>
<xml_diff>
--- a/resume/build/resume.clintp.docx
+++ b/resume/build/resume.clintp.docx
@@ -130,7 +130,7 @@
             </w14:solidFill>
           </w14:textFill>
         </w:rPr>
-        <w:t xml:space="preserve">Software engineering manager with over 10 years experience developing for the web across multiple languages. Highly collaborative with an excellent understanding of development best practices throughout the entire SDLC, growing high-performing agile teams and crafting/executing on company product roadmaps. Demonstrated success in collaborating with both executives and technical/non technical stakeholders, leading to many successful deliveries</w:t>
+        <w:t xml:space="preserve">Software engineering leader with over 20 years experience developing for the web across multiple languages. Highly collaborative with an excellent understanding of development best practices throughout the entire SDLC, growing high-performing agile teams and crafting/executing on company product roadmaps. Demonstrated success in collaborating with both executives and technical/non technical stakeholders, leading to many successful deliveries in early stage to unicorn level startups in the USA</w:t>
       </w:r>
     </w:p>
     <w:p>
@@ -418,7 +418,7 @@
             </w14:solidFill>
           </w14:textFill>
         </w:rPr>
-        <w:t xml:space="preserve">Startup Adviser &amp; Lead Engineer Freelance</w:t>
+        <w:t xml:space="preserve">Bugcrowd</w:t>
       </w:r>
       <w:r>
         <w:rPr>
@@ -436,7 +436,7 @@
             </w14:solidFill>
           </w14:textFill>
         </w:rPr>
-        <w:t xml:space="preserve">, Melbourne, Australia </w:t>
+        <w:t xml:space="preserve">, Melbourne, Australia (Remote) </w:t>
       </w:r>
       <w:r>
         <w:rPr>
@@ -472,7 +472,7 @@
             </w14:solidFill>
           </w14:textFill>
         </w:rPr>
-        <w:t xml:space="preserve">Owner</w:t>
+        <w:t xml:space="preserve">Senior Software Engineer</w:t>
       </w:r>
       <w:r>
         <w:rPr>
@@ -491,7 +491,7 @@
           </w14:textFill>
         </w:rPr>
         <w:tab/>
-        <w:t xml:space="preserve">2023-04-01 - 2024-01-15</w:t>
+        <w:t xml:space="preserve">2024-07-31 - undefined</w:t>
       </w:r>
     </w:p>
     <w:p>
@@ -532,7 +532,186 @@
             </w14:solidFill>
           </w14:textFill>
         </w:rPr>
-        <w:t xml:space="preserve">Startup Adviser, fractional CTO and Lead Engineer, specialising in 0-day startups. I provide strategic guidance, lead MVP development, and offer general, technical, strategic and management expertise to help startups succeed from day one</w:t>
+        <w:t/>
+      </w:r>
+    </w:p>
+    <w:p>
+      <w:pPr>
+        <w:pStyle w:val="Body A"/>
+        <w:tabs>
+          <w:tab w:val="right" w:pos="9360"/>
+        </w:tabs>
+        <w:spacing w:after="0"/>
+        <w:jc w:val="both"/>
+        <w:rPr>
+          <w:rFonts w:ascii="Calibri Light" w:cs="Calibri Light" w:hAnsi="Calibri Light" w:eastAsia="Calibri Light"/>
+          <w:outline w:val="0"/>
+          <w:color w:val="262626"/>
+          <w:sz w:val="20"/>
+          <w:szCs w:val="20"/>
+          <w:u w:color="262626"/>
+          <w14:textFill>
+            <w14:solidFill>
+              <w14:srgbClr w14:val="262626"/>
+            </w14:solidFill>
+          </w14:textFill>
+        </w:rPr>
+      </w:pPr>
+    </w:p>
+    <w:p>
+      <w:pPr>
+        <w:pStyle w:val="Body A"/>
+        <w:tabs>
+          <w:tab w:val="right" w:pos="9916"/>
+        </w:tabs>
+        <w:spacing w:line="252" w:lineRule="auto"/>
+        <w:rPr>
+          <w:rFonts w:ascii="Palatino" w:cs="Palatino" w:hAnsi="Palatino" w:eastAsia="Palatino"/>
+          <w:outline w:val="0"/>
+          <w:color w:val="485970"/>
+          <w:sz w:val="21"/>
+          <w:szCs w:val="21"/>
+          <w:u w:color="485970"/>
+          <w14:textFill>
+            <w14:solidFill>
+              <w14:srgbClr w14:val="485970"/>
+            </w14:solidFill>
+          </w14:textFill>
+        </w:rPr>
+      </w:pPr>
+      <w:r>
+        <w:rPr>
+          <w:rFonts w:ascii="Palatino" w:hAnsi="Palatino"/>
+          <w:b w:val="1"/>
+          <w:bCs w:val="1"/>
+          <w:outline w:val="0"/>
+          <w:color w:val="485970"/>
+          <w:sz w:val="21"/>
+          <w:szCs w:val="21"/>
+          <w:u w:color="485970"/>
+          <w:rtl w:val="0"/>
+          <w:lang w:val="en-US"/>
+          <w14:textFill>
+            <w14:solidFill>
+              <w14:srgbClr w14:val="485970"/>
+            </w14:solidFill>
+          </w14:textFill>
+        </w:rPr>
+        <w:t xml:space="preserve">Contract</w:t>
+      </w:r>
+      <w:r>
+        <w:rPr>
+          <w:rFonts w:ascii="Palatino" w:hAnsi="Palatino"/>
+          <w:outline w:val="0"/>
+          <w:color w:val="485970"/>
+          <w:sz w:val="21"/>
+          <w:szCs w:val="21"/>
+          <w:u w:color="485970"/>
+          <w:rtl w:val="0"/>
+          <w:lang w:val="en-US"/>
+          <w14:textFill>
+            <w14:solidFill>
+              <w14:srgbClr w14:val="485970"/>
+            </w14:solidFill>
+          </w14:textFill>
+        </w:rPr>
+        <w:t xml:space="preserve">, Latin America (Remote) </w:t>
+      </w:r>
+      <w:r>
+        <w:rPr>
+          <w:rFonts w:ascii="Palatino" w:hAnsi="Palatino" w:hint="default"/>
+          <w:outline w:val="0"/>
+          <w:color w:val="485970"/>
+          <w:sz w:val="21"/>
+          <w:szCs w:val="21"/>
+          <w:u w:color="485970"/>
+          <w:rtl w:val="0"/>
+          <w:lang w:val="en-US"/>
+          <w14:textFill>
+            <w14:solidFill>
+              <w14:srgbClr w14:val="485970"/>
+            </w14:solidFill>
+          </w14:textFill>
+        </w:rPr>
+        <w:t xml:space="preserve">• </w:t>
+      </w:r>
+      <w:r>
+        <w:rPr>
+          <w:rFonts w:ascii="Palatino" w:hAnsi="Palatino"/>
+          <w:outline w:val="0"/>
+          <w:color w:val="485970"/>
+          <w:sz w:val="21"/>
+          <w:szCs w:val="21"/>
+          <w:u w:color="485970"/>
+          <w:rtl w:val="0"/>
+          <w:lang w:val="en-US"/>
+          <w14:textFill>
+            <w14:solidFill>
+              <w14:srgbClr w14:val="485970"/>
+            </w14:solidFill>
+          </w14:textFill>
+        </w:rPr>
+        <w:t xml:space="preserve">Fractional CTO / Product Owner / Lead Engineer</w:t>
+      </w:r>
+      <w:r>
+        <w:rPr>
+          <w:rFonts w:ascii="Palatino" w:cs="Palatino" w:hAnsi="Palatino" w:eastAsia="Palatino"/>
+          <w:outline w:val="0"/>
+          <w:color w:val="485970"/>
+          <w:sz w:val="21"/>
+          <w:szCs w:val="21"/>
+          <w:u w:color="485970"/>
+          <w:rtl w:val="0"/>
+          <w:lang w:val="de-DE"/>
+          <w14:textFill>
+            <w14:solidFill>
+              <w14:srgbClr w14:val="485970"/>
+            </w14:solidFill>
+          </w14:textFill>
+        </w:rPr>
+        <w:tab/>
+        <w:t xml:space="preserve">2023-04-01 - 2024-02-01</w:t>
+      </w:r>
+    </w:p>
+    <w:p>
+      <w:pPr>
+        <w:pStyle w:val="Body A"/>
+        <w:tabs>
+          <w:tab w:val="right" w:pos="9360"/>
+        </w:tabs>
+        <w:spacing w:line="240" w:lineRule="auto"/>
+        <w:jc w:val="both"/>
+        <w:rPr>
+          <w:rFonts w:ascii="Calibri Light" w:cs="Calibri Light" w:hAnsi="Calibri Light" w:eastAsia="Calibri Light"/>
+          <w:outline w:val="0"/>
+          <w:color w:val="262626"/>
+          <w:sz w:val="20"/>
+          <w:szCs w:val="20"/>
+          <w:u w:color="262626"/>
+          <w14:textFill>
+            <w14:solidFill>
+              <w14:srgbClr w14:val="262626"/>
+            </w14:solidFill>
+          </w14:textFill>
+        </w:rPr>
+      </w:pPr>
+      <w:r>
+        <w:rPr>
+          <w:rFonts w:ascii="Calibri Light" w:hAnsi="Calibri Light"/>
+          <w:outline w:val="0"/>
+          <w:color w:val="262626"/>
+          <w:sz w:val="20"/>
+          <w:szCs w:val="20"/>
+          <w:u w:color="262626"/>
+          <w:rtl w:val="0"/>
+          <w:lang w:val="en-US"/>
+          <w14:textFill>
+            <w14:solidFill>
+              <w14:srgbClr w14:val="262626"/>
+            </w14:solidFill>
+          </w14:textFill>
+        </w:rPr>
+        <w:t/>
       </w:r>
     </w:p>
     <w:p>
@@ -577,186 +756,7 @@
             </w14:solidFill>
           </w14:textFill>
         </w:rPr>
-        <w:t xml:space="preserve">Worked with some of Australia's most exciting emerging startups</w:t>
-      </w:r>
-    </w:p>
-    <w:p>
-      <w:pPr>
-        <w:pStyle w:val="Body A"/>
-        <w:tabs>
-          <w:tab w:val="right" w:pos="9360"/>
-        </w:tabs>
-        <w:spacing w:after="0"/>
-        <w:jc w:val="both"/>
-        <w:rPr>
-          <w:rFonts w:ascii="Calibri Light" w:cs="Calibri Light" w:hAnsi="Calibri Light" w:eastAsia="Calibri Light"/>
-          <w:outline w:val="0"/>
-          <w:color w:val="262626"/>
-          <w:sz w:val="20"/>
-          <w:szCs w:val="20"/>
-          <w:u w:color="262626"/>
-          <w14:textFill>
-            <w14:solidFill>
-              <w14:srgbClr w14:val="262626"/>
-            </w14:solidFill>
-          </w14:textFill>
-        </w:rPr>
-      </w:pPr>
-    </w:p>
-    <w:p>
-      <w:pPr>
-        <w:pStyle w:val="Body A"/>
-        <w:tabs>
-          <w:tab w:val="right" w:pos="9916"/>
-        </w:tabs>
-        <w:spacing w:line="252" w:lineRule="auto"/>
-        <w:rPr>
-          <w:rFonts w:ascii="Palatino" w:cs="Palatino" w:hAnsi="Palatino" w:eastAsia="Palatino"/>
-          <w:outline w:val="0"/>
-          <w:color w:val="485970"/>
-          <w:sz w:val="21"/>
-          <w:szCs w:val="21"/>
-          <w:u w:color="485970"/>
-          <w14:textFill>
-            <w14:solidFill>
-              <w14:srgbClr w14:val="485970"/>
-            </w14:solidFill>
-          </w14:textFill>
-        </w:rPr>
-      </w:pPr>
-      <w:r>
-        <w:rPr>
-          <w:rFonts w:ascii="Palatino" w:hAnsi="Palatino"/>
-          <w:b w:val="1"/>
-          <w:bCs w:val="1"/>
-          <w:outline w:val="0"/>
-          <w:color w:val="485970"/>
-          <w:sz w:val="21"/>
-          <w:szCs w:val="21"/>
-          <w:u w:color="485970"/>
-          <w:rtl w:val="0"/>
-          <w:lang w:val="en-US"/>
-          <w14:textFill>
-            <w14:solidFill>
-              <w14:srgbClr w14:val="485970"/>
-            </w14:solidFill>
-          </w14:textFill>
-        </w:rPr>
-        <w:t xml:space="preserve">Antler</w:t>
-      </w:r>
-      <w:r>
-        <w:rPr>
-          <w:rFonts w:ascii="Palatino" w:hAnsi="Palatino"/>
-          <w:outline w:val="0"/>
-          <w:color w:val="485970"/>
-          <w:sz w:val="21"/>
-          <w:szCs w:val="21"/>
-          <w:u w:color="485970"/>
-          <w:rtl w:val="0"/>
-          <w:lang w:val="en-US"/>
-          <w14:textFill>
-            <w14:solidFill>
-              <w14:srgbClr w14:val="485970"/>
-            </w14:solidFill>
-          </w14:textFill>
-        </w:rPr>
-        <w:t xml:space="preserve">, Melbourne, Australia </w:t>
-      </w:r>
-      <w:r>
-        <w:rPr>
-          <w:rFonts w:ascii="Palatino" w:hAnsi="Palatino" w:hint="default"/>
-          <w:outline w:val="0"/>
-          <w:color w:val="485970"/>
-          <w:sz w:val="21"/>
-          <w:szCs w:val="21"/>
-          <w:u w:color="485970"/>
-          <w:rtl w:val="0"/>
-          <w:lang w:val="en-US"/>
-          <w14:textFill>
-            <w14:solidFill>
-              <w14:srgbClr w14:val="485970"/>
-            </w14:solidFill>
-          </w14:textFill>
-        </w:rPr>
-        <w:t xml:space="preserve">• </w:t>
-      </w:r>
-      <w:r>
-        <w:rPr>
-          <w:rFonts w:ascii="Palatino" w:hAnsi="Palatino"/>
-          <w:outline w:val="0"/>
-          <w:color w:val="485970"/>
-          <w:sz w:val="21"/>
-          <w:szCs w:val="21"/>
-          <w:u w:color="485970"/>
-          <w:rtl w:val="0"/>
-          <w:lang w:val="en-US"/>
-          <w14:textFill>
-            <w14:solidFill>
-              <w14:srgbClr w14:val="485970"/>
-            </w14:solidFill>
-          </w14:textFill>
-        </w:rPr>
-        <w:t xml:space="preserve">Entrepreneur in Residence</w:t>
-      </w:r>
-      <w:r>
-        <w:rPr>
-          <w:rFonts w:ascii="Palatino" w:cs="Palatino" w:hAnsi="Palatino" w:eastAsia="Palatino"/>
-          <w:outline w:val="0"/>
-          <w:color w:val="485970"/>
-          <w:sz w:val="21"/>
-          <w:szCs w:val="21"/>
-          <w:u w:color="485970"/>
-          <w:rtl w:val="0"/>
-          <w:lang w:val="de-DE"/>
-          <w14:textFill>
-            <w14:solidFill>
-              <w14:srgbClr w14:val="485970"/>
-            </w14:solidFill>
-          </w14:textFill>
-        </w:rPr>
-        <w:tab/>
-        <w:t xml:space="preserve">2022-05-01 - 2023-04-01</w:t>
-      </w:r>
-    </w:p>
-    <w:p>
-      <w:pPr>
-        <w:pStyle w:val="Body A"/>
-        <w:tabs>
-          <w:tab w:val="right" w:pos="9360"/>
-        </w:tabs>
-        <w:spacing w:line="240" w:lineRule="auto"/>
-        <w:jc w:val="both"/>
-        <w:rPr>
-          <w:rFonts w:ascii="Calibri Light" w:cs="Calibri Light" w:hAnsi="Calibri Light" w:eastAsia="Calibri Light"/>
-          <w:outline w:val="0"/>
-          <w:color w:val="262626"/>
-          <w:sz w:val="20"/>
-          <w:szCs w:val="20"/>
-          <w:u w:color="262626"/>
-          <w14:textFill>
-            <w14:solidFill>
-              <w14:srgbClr w14:val="262626"/>
-            </w14:solidFill>
-          </w14:textFill>
-        </w:rPr>
-      </w:pPr>
-      <w:r>
-        <w:rPr>
-          <w:rFonts w:ascii="Calibri Light" w:hAnsi="Calibri Light"/>
-          <w:outline w:val="0"/>
-          <w:color w:val="262626"/>
-          <w:sz w:val="20"/>
-          <w:szCs w:val="20"/>
-          <w:u w:color="262626"/>
-          <w:rtl w:val="0"/>
-          <w:lang w:val="en-US"/>
-          <w14:textFill>
-            <w14:solidFill>
-              <w14:srgbClr w14:val="262626"/>
-            </w14:solidFill>
-          </w14:textFill>
-        </w:rPr>
-        <w:t xml:space="preserve">Joined the program to explore nurturing my own startup, learnt many valuable skills along the way from ideation, taking concepts to market (0 to 1), market validation, business models, product/market fit to capital raising/pitching</w:t>
+        <w:t xml:space="preserve">Led products from ideation to market launch by spearheading discovery, story mapping, impact mapping, MDP (Most Delightful Product) development, GTM (Go-To-Market) strategy, and market validation</w:t>
       </w:r>
     </w:p>
     <w:p>
@@ -801,7 +801,7 @@
             </w14:solidFill>
           </w14:textFill>
         </w:rPr>
-        <w:t xml:space="preserve">Developed strong problem-solving and critical thinking skills by identifying and addressing challenges facing early-stage startups</w:t>
+        <w:t xml:space="preserve">Lead, Managed &amp; Mentored teams of 3-6</w:t>
       </w:r>
     </w:p>
     <w:p>
@@ -846,7 +846,365 @@
             </w14:solidFill>
           </w14:textFill>
         </w:rPr>
-        <w:t xml:space="preserve">Gained experience in business strategy, market analysis, and financial planning to help startups develop sustainable and scalable business models</w:t>
+        <w:t xml:space="preserve">Ruby/ROR/Python/Node/ChatGPT API/Serverless/AWS</w:t>
+      </w:r>
+    </w:p>
+    <w:p>
+      <w:pPr>
+        <w:pStyle w:val="Body A"/>
+        <w:tabs>
+          <w:tab w:val="right" w:pos="9360"/>
+        </w:tabs>
+        <w:spacing w:after="0"/>
+        <w:jc w:val="both"/>
+        <w:rPr>
+          <w:rFonts w:ascii="Calibri Light" w:cs="Calibri Light" w:hAnsi="Calibri Light" w:eastAsia="Calibri Light"/>
+          <w:outline w:val="0"/>
+          <w:color w:val="262626"/>
+          <w:sz w:val="20"/>
+          <w:szCs w:val="20"/>
+          <w:u w:color="262626"/>
+          <w14:textFill>
+            <w14:solidFill>
+              <w14:srgbClr w14:val="262626"/>
+            </w14:solidFill>
+          </w14:textFill>
+        </w:rPr>
+      </w:pPr>
+    </w:p>
+    <w:p>
+      <w:pPr>
+        <w:pStyle w:val="Body A"/>
+        <w:tabs>
+          <w:tab w:val="right" w:pos="9916"/>
+        </w:tabs>
+        <w:spacing w:line="252" w:lineRule="auto"/>
+        <w:rPr>
+          <w:rFonts w:ascii="Palatino" w:cs="Palatino" w:hAnsi="Palatino" w:eastAsia="Palatino"/>
+          <w:outline w:val="0"/>
+          <w:color w:val="485970"/>
+          <w:sz w:val="21"/>
+          <w:szCs w:val="21"/>
+          <w:u w:color="485970"/>
+          <w14:textFill>
+            <w14:solidFill>
+              <w14:srgbClr w14:val="485970"/>
+            </w14:solidFill>
+          </w14:textFill>
+        </w:rPr>
+      </w:pPr>
+      <w:r>
+        <w:rPr>
+          <w:rFonts w:ascii="Palatino" w:hAnsi="Palatino"/>
+          <w:b w:val="1"/>
+          <w:bCs w:val="1"/>
+          <w:outline w:val="0"/>
+          <w:color w:val="485970"/>
+          <w:sz w:val="21"/>
+          <w:szCs w:val="21"/>
+          <w:u w:color="485970"/>
+          <w:rtl w:val="0"/>
+          <w:lang w:val="en-US"/>
+          <w14:textFill>
+            <w14:solidFill>
+              <w14:srgbClr w14:val="485970"/>
+            </w14:solidFill>
+          </w14:textFill>
+        </w:rPr>
+        <w:t xml:space="preserve">Antler</w:t>
+      </w:r>
+      <w:r>
+        <w:rPr>
+          <w:rFonts w:ascii="Palatino" w:hAnsi="Palatino"/>
+          <w:outline w:val="0"/>
+          <w:color w:val="485970"/>
+          <w:sz w:val="21"/>
+          <w:szCs w:val="21"/>
+          <w:u w:color="485970"/>
+          <w:rtl w:val="0"/>
+          <w:lang w:val="en-US"/>
+          <w14:textFill>
+            <w14:solidFill>
+              <w14:srgbClr w14:val="485970"/>
+            </w14:solidFill>
+          </w14:textFill>
+        </w:rPr>
+        <w:t xml:space="preserve">, Melbourne, Australia </w:t>
+      </w:r>
+      <w:r>
+        <w:rPr>
+          <w:rFonts w:ascii="Palatino" w:hAnsi="Palatino" w:hint="default"/>
+          <w:outline w:val="0"/>
+          <w:color w:val="485970"/>
+          <w:sz w:val="21"/>
+          <w:szCs w:val="21"/>
+          <w:u w:color="485970"/>
+          <w:rtl w:val="0"/>
+          <w:lang w:val="en-US"/>
+          <w14:textFill>
+            <w14:solidFill>
+              <w14:srgbClr w14:val="485970"/>
+            </w14:solidFill>
+          </w14:textFill>
+        </w:rPr>
+        <w:t xml:space="preserve">• </w:t>
+      </w:r>
+      <w:r>
+        <w:rPr>
+          <w:rFonts w:ascii="Palatino" w:hAnsi="Palatino"/>
+          <w:outline w:val="0"/>
+          <w:color w:val="485970"/>
+          <w:sz w:val="21"/>
+          <w:szCs w:val="21"/>
+          <w:u w:color="485970"/>
+          <w:rtl w:val="0"/>
+          <w:lang w:val="en-US"/>
+          <w14:textFill>
+            <w14:solidFill>
+              <w14:srgbClr w14:val="485970"/>
+            </w14:solidFill>
+          </w14:textFill>
+        </w:rPr>
+        <w:t xml:space="preserve">Entrepreneur in Residence</w:t>
+      </w:r>
+      <w:r>
+        <w:rPr>
+          <w:rFonts w:ascii="Palatino" w:cs="Palatino" w:hAnsi="Palatino" w:eastAsia="Palatino"/>
+          <w:outline w:val="0"/>
+          <w:color w:val="485970"/>
+          <w:sz w:val="21"/>
+          <w:szCs w:val="21"/>
+          <w:u w:color="485970"/>
+          <w:rtl w:val="0"/>
+          <w:lang w:val="de-DE"/>
+          <w14:textFill>
+            <w14:solidFill>
+              <w14:srgbClr w14:val="485970"/>
+            </w14:solidFill>
+          </w14:textFill>
+        </w:rPr>
+        <w:tab/>
+        <w:t xml:space="preserve">2022-05-01 - 2023-04-01</w:t>
+      </w:r>
+    </w:p>
+    <w:p>
+      <w:pPr>
+        <w:pStyle w:val="Body A"/>
+        <w:tabs>
+          <w:tab w:val="right" w:pos="9360"/>
+        </w:tabs>
+        <w:spacing w:line="240" w:lineRule="auto"/>
+        <w:jc w:val="both"/>
+        <w:rPr>
+          <w:rFonts w:ascii="Calibri Light" w:cs="Calibri Light" w:hAnsi="Calibri Light" w:eastAsia="Calibri Light"/>
+          <w:outline w:val="0"/>
+          <w:color w:val="262626"/>
+          <w:sz w:val="20"/>
+          <w:szCs w:val="20"/>
+          <w:u w:color="262626"/>
+          <w14:textFill>
+            <w14:solidFill>
+              <w14:srgbClr w14:val="262626"/>
+            </w14:solidFill>
+          </w14:textFill>
+        </w:rPr>
+      </w:pPr>
+      <w:r>
+        <w:rPr>
+          <w:rFonts w:ascii="Calibri Light" w:hAnsi="Calibri Light"/>
+          <w:outline w:val="0"/>
+          <w:color w:val="262626"/>
+          <w:sz w:val="20"/>
+          <w:szCs w:val="20"/>
+          <w:u w:color="262626"/>
+          <w:rtl w:val="0"/>
+          <w:lang w:val="en-US"/>
+          <w14:textFill>
+            <w14:solidFill>
+              <w14:srgbClr w14:val="262626"/>
+            </w14:solidFill>
+          </w14:textFill>
+        </w:rPr>
+        <w:t xml:space="preserve">Joined the program to explore nurturing my own startup aka 'The Practical MBA', learnt many valuable skills along the way from ideation, taking concepts to market (0 to 1), market validation, business models, product/market fit to capital raising and pitching to committees</w:t>
+      </w:r>
+    </w:p>
+    <w:p>
+      <w:pPr>
+        <w:pStyle w:val="Body A"/>
+        <w:tabs>
+          <w:tab w:val="right" w:pos="9360"/>
+        </w:tabs>
+        <w:spacing w:after="0"/>
+        <w:jc w:val="both"/>
+        <w:rPr>
+          <w:rFonts w:ascii="Calibri Light" w:cs="Calibri Light" w:hAnsi="Calibri Light" w:eastAsia="Calibri Light"/>
+          <w:outline w:val="0"/>
+          <w:color w:val="262626"/>
+          <w:sz w:val="20"/>
+          <w:szCs w:val="20"/>
+          <w:u w:color="262626"/>
+          <w14:textFill>
+            <w14:solidFill>
+              <w14:srgbClr w14:val="262626"/>
+            </w14:solidFill>
+          </w14:textFill>
+        </w:rPr>
+      </w:pPr>
+    </w:p>
+    <w:p>
+      <w:pPr>
+        <w:pStyle w:val="Body A"/>
+        <w:tabs>
+          <w:tab w:val="right" w:pos="9916"/>
+        </w:tabs>
+        <w:spacing w:line="252" w:lineRule="auto"/>
+        <w:rPr>
+          <w:rFonts w:ascii="Palatino" w:cs="Palatino" w:hAnsi="Palatino" w:eastAsia="Palatino"/>
+          <w:outline w:val="0"/>
+          <w:color w:val="485970"/>
+          <w:sz w:val="21"/>
+          <w:szCs w:val="21"/>
+          <w:u w:color="485970"/>
+          <w14:textFill>
+            <w14:solidFill>
+              <w14:srgbClr w14:val="485970"/>
+            </w14:solidFill>
+          </w14:textFill>
+        </w:rPr>
+      </w:pPr>
+      <w:r>
+        <w:rPr>
+          <w:rFonts w:ascii="Palatino" w:hAnsi="Palatino"/>
+          <w:b w:val="1"/>
+          <w:bCs w:val="1"/>
+          <w:outline w:val="0"/>
+          <w:color w:val="485970"/>
+          <w:sz w:val="21"/>
+          <w:szCs w:val="21"/>
+          <w:u w:color="485970"/>
+          <w:rtl w:val="0"/>
+          <w:lang w:val="en-US"/>
+          <w14:textFill>
+            <w14:solidFill>
+              <w14:srgbClr w14:val="485970"/>
+            </w14:solidFill>
+          </w14:textFill>
+        </w:rPr>
+        <w:t xml:space="preserve">Will I Wake</w:t>
+      </w:r>
+      <w:r>
+        <w:rPr>
+          <w:rFonts w:ascii="Palatino" w:hAnsi="Palatino"/>
+          <w:outline w:val="0"/>
+          <w:color w:val="485970"/>
+          <w:sz w:val="21"/>
+          <w:szCs w:val="21"/>
+          <w:u w:color="485970"/>
+          <w:rtl w:val="0"/>
+          <w:lang w:val="en-US"/>
+          <w14:textFill>
+            <w14:solidFill>
+              <w14:srgbClr w14:val="485970"/>
+            </w14:solidFill>
+          </w14:textFill>
+        </w:rPr>
+        <w:t xml:space="preserve">, Melbourne, Australia </w:t>
+      </w:r>
+      <w:r>
+        <w:rPr>
+          <w:rFonts w:ascii="Palatino" w:hAnsi="Palatino" w:hint="default"/>
+          <w:outline w:val="0"/>
+          <w:color w:val="485970"/>
+          <w:sz w:val="21"/>
+          <w:szCs w:val="21"/>
+          <w:u w:color="485970"/>
+          <w:rtl w:val="0"/>
+          <w:lang w:val="en-US"/>
+          <w14:textFill>
+            <w14:solidFill>
+              <w14:srgbClr w14:val="485970"/>
+            </w14:solidFill>
+          </w14:textFill>
+        </w:rPr>
+        <w:t xml:space="preserve">• </w:t>
+      </w:r>
+      <w:r>
+        <w:rPr>
+          <w:rFonts w:ascii="Palatino" w:hAnsi="Palatino"/>
+          <w:outline w:val="0"/>
+          <w:color w:val="485970"/>
+          <w:sz w:val="21"/>
+          <w:szCs w:val="21"/>
+          <w:u w:color="485970"/>
+          <w:rtl w:val="0"/>
+          <w:lang w:val="en-US"/>
+          <w14:textFill>
+            <w14:solidFill>
+              <w14:srgbClr w14:val="485970"/>
+            </w14:solidFill>
+          </w14:textFill>
+        </w:rPr>
+        <w:t xml:space="preserve">Founder / CTO</w:t>
+      </w:r>
+      <w:r>
+        <w:rPr>
+          <w:rFonts w:ascii="Palatino" w:cs="Palatino" w:hAnsi="Palatino" w:eastAsia="Palatino"/>
+          <w:outline w:val="0"/>
+          <w:color w:val="485970"/>
+          <w:sz w:val="21"/>
+          <w:szCs w:val="21"/>
+          <w:u w:color="485970"/>
+          <w:rtl w:val="0"/>
+          <w:lang w:val="de-DE"/>
+          <w14:textFill>
+            <w14:solidFill>
+              <w14:srgbClr w14:val="485970"/>
+            </w14:solidFill>
+          </w14:textFill>
+        </w:rPr>
+        <w:tab/>
+        <w:t xml:space="preserve">2021-03-01 - 2022-02-01</w:t>
+      </w:r>
+    </w:p>
+    <w:p>
+      <w:pPr>
+        <w:pStyle w:val="Body A"/>
+        <w:tabs>
+          <w:tab w:val="right" w:pos="9360"/>
+        </w:tabs>
+        <w:spacing w:line="240" w:lineRule="auto"/>
+        <w:jc w:val="both"/>
+        <w:rPr>
+          <w:rFonts w:ascii="Calibri Light" w:cs="Calibri Light" w:hAnsi="Calibri Light" w:eastAsia="Calibri Light"/>
+          <w:outline w:val="0"/>
+          <w:color w:val="262626"/>
+          <w:sz w:val="20"/>
+          <w:szCs w:val="20"/>
+          <w:u w:color="262626"/>
+          <w14:textFill>
+            <w14:solidFill>
+              <w14:srgbClr w14:val="262626"/>
+            </w14:solidFill>
+          </w14:textFill>
+        </w:rPr>
+      </w:pPr>
+      <w:r>
+        <w:rPr>
+          <w:rFonts w:ascii="Calibri Light" w:hAnsi="Calibri Light"/>
+          <w:outline w:val="0"/>
+          <w:color w:val="262626"/>
+          <w:sz w:val="20"/>
+          <w:szCs w:val="20"/>
+          <w:u w:color="262626"/>
+          <w:rtl w:val="0"/>
+          <w:lang w:val="en-US"/>
+          <w14:textFill>
+            <w14:solidFill>
+              <w14:srgbClr w14:val="262626"/>
+            </w14:solidFill>
+          </w14:textFill>
+        </w:rPr>
+        <w:t/>
       </w:r>
     </w:p>
     <w:p>
@@ -891,7 +1249,7 @@
             </w14:solidFill>
           </w14:textFill>
         </w:rPr>
-        <w:t xml:space="preserve">Built a diverse and global network of entrepreneurs, investors, and industry experts to share insights and best practices and create new opportunities for collaboration</w:t>
+        <w:t xml:space="preserve">Created a robust MVP and high-converting landing page using Ruby on Rails, React, Terraform, and AWS; validated product-market fit, resulting in a 40% increase in early user adoption</w:t>
       </w:r>
     </w:p>
     <w:p>
@@ -936,7 +1294,186 @@
             </w14:solidFill>
           </w14:textFill>
         </w:rPr>
-        <w:t xml:space="preserve">Honed skills in pitching and presenting to effectively communicate complex ideas and value propositions to investors, customers, and other stakeholders</w:t>
+        <w:t xml:space="preserve">Pitched to Antler &amp; was selected to join their accelerator program</w:t>
+      </w:r>
+    </w:p>
+    <w:p>
+      <w:pPr>
+        <w:pStyle w:val="Body A"/>
+        <w:tabs>
+          <w:tab w:val="right" w:pos="9360"/>
+        </w:tabs>
+        <w:spacing w:after="0"/>
+        <w:jc w:val="both"/>
+        <w:rPr>
+          <w:rFonts w:ascii="Calibri Light" w:cs="Calibri Light" w:hAnsi="Calibri Light" w:eastAsia="Calibri Light"/>
+          <w:outline w:val="0"/>
+          <w:color w:val="262626"/>
+          <w:sz w:val="20"/>
+          <w:szCs w:val="20"/>
+          <w:u w:color="262626"/>
+          <w14:textFill>
+            <w14:solidFill>
+              <w14:srgbClr w14:val="262626"/>
+            </w14:solidFill>
+          </w14:textFill>
+        </w:rPr>
+      </w:pPr>
+    </w:p>
+    <w:p>
+      <w:pPr>
+        <w:pStyle w:val="Body A"/>
+        <w:tabs>
+          <w:tab w:val="right" w:pos="9916"/>
+        </w:tabs>
+        <w:spacing w:line="252" w:lineRule="auto"/>
+        <w:rPr>
+          <w:rFonts w:ascii="Palatino" w:cs="Palatino" w:hAnsi="Palatino" w:eastAsia="Palatino"/>
+          <w:outline w:val="0"/>
+          <w:color w:val="485970"/>
+          <w:sz w:val="21"/>
+          <w:szCs w:val="21"/>
+          <w:u w:color="485970"/>
+          <w14:textFill>
+            <w14:solidFill>
+              <w14:srgbClr w14:val="485970"/>
+            </w14:solidFill>
+          </w14:textFill>
+        </w:rPr>
+      </w:pPr>
+      <w:r>
+        <w:rPr>
+          <w:rFonts w:ascii="Palatino" w:hAnsi="Palatino"/>
+          <w:b w:val="1"/>
+          <w:bCs w:val="1"/>
+          <w:outline w:val="0"/>
+          <w:color w:val="485970"/>
+          <w:sz w:val="21"/>
+          <w:szCs w:val="21"/>
+          <w:u w:color="485970"/>
+          <w:rtl w:val="0"/>
+          <w:lang w:val="en-US"/>
+          <w14:textFill>
+            <w14:solidFill>
+              <w14:srgbClr w14:val="485970"/>
+            </w14:solidFill>
+          </w14:textFill>
+        </w:rPr>
+        <w:t/>
+      </w:r>
+      <w:r>
+        <w:rPr>
+          <w:rFonts w:ascii="Palatino" w:hAnsi="Palatino"/>
+          <w:outline w:val="0"/>
+          <w:color w:val="485970"/>
+          <w:sz w:val="21"/>
+          <w:szCs w:val="21"/>
+          <w:u w:color="485970"/>
+          <w:rtl w:val="0"/>
+          <w:lang w:val="en-US"/>
+          <w14:textFill>
+            <w14:solidFill>
+              <w14:srgbClr w14:val="485970"/>
+            </w14:solidFill>
+          </w14:textFill>
+        </w:rPr>
+        <w:t xml:space="preserve">, Melbourne, Australia </w:t>
+      </w:r>
+      <w:r>
+        <w:rPr>
+          <w:rFonts w:ascii="Palatino" w:hAnsi="Palatino" w:hint="default"/>
+          <w:outline w:val="0"/>
+          <w:color w:val="485970"/>
+          <w:sz w:val="21"/>
+          <w:szCs w:val="21"/>
+          <w:u w:color="485970"/>
+          <w:rtl w:val="0"/>
+          <w:lang w:val="en-US"/>
+          <w14:textFill>
+            <w14:solidFill>
+              <w14:srgbClr w14:val="485970"/>
+            </w14:solidFill>
+          </w14:textFill>
+        </w:rPr>
+        <w:t xml:space="preserve">• </w:t>
+      </w:r>
+      <w:r>
+        <w:rPr>
+          <w:rFonts w:ascii="Palatino" w:hAnsi="Palatino"/>
+          <w:outline w:val="0"/>
+          <w:color w:val="485970"/>
+          <w:sz w:val="21"/>
+          <w:szCs w:val="21"/>
+          <w:u w:color="485970"/>
+          <w:rtl w:val="0"/>
+          <w:lang w:val="en-US"/>
+          <w14:textFill>
+            <w14:solidFill>
+              <w14:srgbClr w14:val="485970"/>
+            </w14:solidFill>
+          </w14:textFill>
+        </w:rPr>
+        <w:t xml:space="preserve">Career Break</w:t>
+      </w:r>
+      <w:r>
+        <w:rPr>
+          <w:rFonts w:ascii="Palatino" w:cs="Palatino" w:hAnsi="Palatino" w:eastAsia="Palatino"/>
+          <w:outline w:val="0"/>
+          <w:color w:val="485970"/>
+          <w:sz w:val="21"/>
+          <w:szCs w:val="21"/>
+          <w:u w:color="485970"/>
+          <w:rtl w:val="0"/>
+          <w:lang w:val="de-DE"/>
+          <w14:textFill>
+            <w14:solidFill>
+              <w14:srgbClr w14:val="485970"/>
+            </w14:solidFill>
+          </w14:textFill>
+        </w:rPr>
+        <w:tab/>
+        <w:t xml:space="preserve">2020-04-01 - 2021-12-01</w:t>
+      </w:r>
+    </w:p>
+    <w:p>
+      <w:pPr>
+        <w:pStyle w:val="Body A"/>
+        <w:tabs>
+          <w:tab w:val="right" w:pos="9360"/>
+        </w:tabs>
+        <w:spacing w:line="240" w:lineRule="auto"/>
+        <w:jc w:val="both"/>
+        <w:rPr>
+          <w:rFonts w:ascii="Calibri Light" w:cs="Calibri Light" w:hAnsi="Calibri Light" w:eastAsia="Calibri Light"/>
+          <w:outline w:val="0"/>
+          <w:color w:val="262626"/>
+          <w:sz w:val="20"/>
+          <w:szCs w:val="20"/>
+          <w:u w:color="262626"/>
+          <w14:textFill>
+            <w14:solidFill>
+              <w14:srgbClr w14:val="262626"/>
+            </w14:solidFill>
+          </w14:textFill>
+        </w:rPr>
+      </w:pPr>
+      <w:r>
+        <w:rPr>
+          <w:rFonts w:ascii="Calibri Light" w:hAnsi="Calibri Light"/>
+          <w:outline w:val="0"/>
+          <w:color w:val="262626"/>
+          <w:sz w:val="20"/>
+          <w:szCs w:val="20"/>
+          <w:u w:color="262626"/>
+          <w:rtl w:val="0"/>
+          <w:lang w:val="en-US"/>
+          <w14:textFill>
+            <w14:solidFill>
+              <w14:srgbClr w14:val="262626"/>
+            </w14:solidFill>
+          </w14:textFill>
+        </w:rPr>
+        <w:t xml:space="preserve">Took a career break post COVID to re-evaluate my career, growth opportunities &amp; pursue a personal goal of travelling around Australia. Completed an entire lap of the country travelling around 30,000KM, An amazingly rewarding experience</w:t>
       </w:r>
     </w:p>
     <w:p>
@@ -981,186 +1518,7 @@
             </w14:solidFill>
           </w14:textFill>
         </w:rPr>
-        <w:t xml:space="preserve">Developed a deep understanding of emerging technologies and trends and how they are reshaping industries and markets, enabling more informed decision-making and innovative thinking</w:t>
-      </w:r>
-    </w:p>
-    <w:p>
-      <w:pPr>
-        <w:pStyle w:val="Body A"/>
-        <w:tabs>
-          <w:tab w:val="right" w:pos="9360"/>
-        </w:tabs>
-        <w:spacing w:after="0"/>
-        <w:jc w:val="both"/>
-        <w:rPr>
-          <w:rFonts w:ascii="Calibri Light" w:cs="Calibri Light" w:hAnsi="Calibri Light" w:eastAsia="Calibri Light"/>
-          <w:outline w:val="0"/>
-          <w:color w:val="262626"/>
-          <w:sz w:val="20"/>
-          <w:szCs w:val="20"/>
-          <w:u w:color="262626"/>
-          <w14:textFill>
-            <w14:solidFill>
-              <w14:srgbClr w14:val="262626"/>
-            </w14:solidFill>
-          </w14:textFill>
-        </w:rPr>
-      </w:pPr>
-    </w:p>
-    <w:p>
-      <w:pPr>
-        <w:pStyle w:val="Body A"/>
-        <w:tabs>
-          <w:tab w:val="right" w:pos="9916"/>
-        </w:tabs>
-        <w:spacing w:line="252" w:lineRule="auto"/>
-        <w:rPr>
-          <w:rFonts w:ascii="Palatino" w:cs="Palatino" w:hAnsi="Palatino" w:eastAsia="Palatino"/>
-          <w:outline w:val="0"/>
-          <w:color w:val="485970"/>
-          <w:sz w:val="21"/>
-          <w:szCs w:val="21"/>
-          <w:u w:color="485970"/>
-          <w14:textFill>
-            <w14:solidFill>
-              <w14:srgbClr w14:val="485970"/>
-            </w14:solidFill>
-          </w14:textFill>
-        </w:rPr>
-      </w:pPr>
-      <w:r>
-        <w:rPr>
-          <w:rFonts w:ascii="Palatino" w:hAnsi="Palatino"/>
-          <w:b w:val="1"/>
-          <w:bCs w:val="1"/>
-          <w:outline w:val="0"/>
-          <w:color w:val="485970"/>
-          <w:sz w:val="21"/>
-          <w:szCs w:val="21"/>
-          <w:u w:color="485970"/>
-          <w:rtl w:val="0"/>
-          <w:lang w:val="en-US"/>
-          <w14:textFill>
-            <w14:solidFill>
-              <w14:srgbClr w14:val="485970"/>
-            </w14:solidFill>
-          </w14:textFill>
-        </w:rPr>
-        <w:t xml:space="preserve">Will I Wake</w:t>
-      </w:r>
-      <w:r>
-        <w:rPr>
-          <w:rFonts w:ascii="Palatino" w:hAnsi="Palatino"/>
-          <w:outline w:val="0"/>
-          <w:color w:val="485970"/>
-          <w:sz w:val="21"/>
-          <w:szCs w:val="21"/>
-          <w:u w:color="485970"/>
-          <w:rtl w:val="0"/>
-          <w:lang w:val="en-US"/>
-          <w14:textFill>
-            <w14:solidFill>
-              <w14:srgbClr w14:val="485970"/>
-            </w14:solidFill>
-          </w14:textFill>
-        </w:rPr>
-        <w:t xml:space="preserve">, Melbourne, Australia </w:t>
-      </w:r>
-      <w:r>
-        <w:rPr>
-          <w:rFonts w:ascii="Palatino" w:hAnsi="Palatino" w:hint="default"/>
-          <w:outline w:val="0"/>
-          <w:color w:val="485970"/>
-          <w:sz w:val="21"/>
-          <w:szCs w:val="21"/>
-          <w:u w:color="485970"/>
-          <w:rtl w:val="0"/>
-          <w:lang w:val="en-US"/>
-          <w14:textFill>
-            <w14:solidFill>
-              <w14:srgbClr w14:val="485970"/>
-            </w14:solidFill>
-          </w14:textFill>
-        </w:rPr>
-        <w:t xml:space="preserve">• </w:t>
-      </w:r>
-      <w:r>
-        <w:rPr>
-          <w:rFonts w:ascii="Palatino" w:hAnsi="Palatino"/>
-          <w:outline w:val="0"/>
-          <w:color w:val="485970"/>
-          <w:sz w:val="21"/>
-          <w:szCs w:val="21"/>
-          <w:u w:color="485970"/>
-          <w:rtl w:val="0"/>
-          <w:lang w:val="en-US"/>
-          <w14:textFill>
-            <w14:solidFill>
-              <w14:srgbClr w14:val="485970"/>
-            </w14:solidFill>
-          </w14:textFill>
-        </w:rPr>
-        <w:t xml:space="preserve">Founder</w:t>
-      </w:r>
-      <w:r>
-        <w:rPr>
-          <w:rFonts w:ascii="Palatino" w:cs="Palatino" w:hAnsi="Palatino" w:eastAsia="Palatino"/>
-          <w:outline w:val="0"/>
-          <w:color w:val="485970"/>
-          <w:sz w:val="21"/>
-          <w:szCs w:val="21"/>
-          <w:u w:color="485970"/>
-          <w:rtl w:val="0"/>
-          <w:lang w:val="de-DE"/>
-          <w14:textFill>
-            <w14:solidFill>
-              <w14:srgbClr w14:val="485970"/>
-            </w14:solidFill>
-          </w14:textFill>
-        </w:rPr>
-        <w:tab/>
-        <w:t xml:space="preserve">2021-03-01 - 2022-01-01</w:t>
-      </w:r>
-    </w:p>
-    <w:p>
-      <w:pPr>
-        <w:pStyle w:val="Body A"/>
-        <w:tabs>
-          <w:tab w:val="right" w:pos="9360"/>
-        </w:tabs>
-        <w:spacing w:line="240" w:lineRule="auto"/>
-        <w:jc w:val="both"/>
-        <w:rPr>
-          <w:rFonts w:ascii="Calibri Light" w:cs="Calibri Light" w:hAnsi="Calibri Light" w:eastAsia="Calibri Light"/>
-          <w:outline w:val="0"/>
-          <w:color w:val="262626"/>
-          <w:sz w:val="20"/>
-          <w:szCs w:val="20"/>
-          <w:u w:color="262626"/>
-          <w14:textFill>
-            <w14:solidFill>
-              <w14:srgbClr w14:val="262626"/>
-            </w14:solidFill>
-          </w14:textFill>
-        </w:rPr>
-      </w:pPr>
-      <w:r>
-        <w:rPr>
-          <w:rFonts w:ascii="Calibri Light" w:hAnsi="Calibri Light"/>
-          <w:outline w:val="0"/>
-          <w:color w:val="262626"/>
-          <w:sz w:val="20"/>
-          <w:szCs w:val="20"/>
-          <w:u w:color="262626"/>
-          <w:rtl w:val="0"/>
-          <w:lang w:val="en-US"/>
-          <w14:textFill>
-            <w14:solidFill>
-              <w14:srgbClr w14:val="262626"/>
-            </w14:solidFill>
-          </w14:textFill>
-        </w:rPr>
-        <w:t/>
+        <w:t xml:space="preserve">Invested in personal growth, self-reflection, and self-care</w:t>
       </w:r>
     </w:p>
     <w:p>
@@ -1205,7 +1563,186 @@
             </w14:solidFill>
           </w14:textFill>
         </w:rPr>
-        <w:t xml:space="preserve">Ran multiple campaigns to evaluate problem/solution fit</w:t>
+        <w:t xml:space="preserve">Investigated undertaking an MBA but decided against it in favour of a more hands-on approach to learning by doing</w:t>
+      </w:r>
+    </w:p>
+    <w:p>
+      <w:pPr>
+        <w:pStyle w:val="Body A"/>
+        <w:tabs>
+          <w:tab w:val="right" w:pos="9360"/>
+        </w:tabs>
+        <w:spacing w:after="0"/>
+        <w:jc w:val="both"/>
+        <w:rPr>
+          <w:rFonts w:ascii="Calibri Light" w:cs="Calibri Light" w:hAnsi="Calibri Light" w:eastAsia="Calibri Light"/>
+          <w:outline w:val="0"/>
+          <w:color w:val="262626"/>
+          <w:sz w:val="20"/>
+          <w:szCs w:val="20"/>
+          <w:u w:color="262626"/>
+          <w14:textFill>
+            <w14:solidFill>
+              <w14:srgbClr w14:val="262626"/>
+            </w14:solidFill>
+          </w14:textFill>
+        </w:rPr>
+      </w:pPr>
+    </w:p>
+    <w:p>
+      <w:pPr>
+        <w:pStyle w:val="Body A"/>
+        <w:tabs>
+          <w:tab w:val="right" w:pos="9916"/>
+        </w:tabs>
+        <w:spacing w:line="252" w:lineRule="auto"/>
+        <w:rPr>
+          <w:rFonts w:ascii="Palatino" w:cs="Palatino" w:hAnsi="Palatino" w:eastAsia="Palatino"/>
+          <w:outline w:val="0"/>
+          <w:color w:val="485970"/>
+          <w:sz w:val="21"/>
+          <w:szCs w:val="21"/>
+          <w:u w:color="485970"/>
+          <w14:textFill>
+            <w14:solidFill>
+              <w14:srgbClr w14:val="485970"/>
+            </w14:solidFill>
+          </w14:textFill>
+        </w:rPr>
+      </w:pPr>
+      <w:r>
+        <w:rPr>
+          <w:rFonts w:ascii="Palatino" w:hAnsi="Palatino"/>
+          <w:b w:val="1"/>
+          <w:bCs w:val="1"/>
+          <w:outline w:val="0"/>
+          <w:color w:val="485970"/>
+          <w:sz w:val="21"/>
+          <w:szCs w:val="21"/>
+          <w:u w:color="485970"/>
+          <w:rtl w:val="0"/>
+          <w:lang w:val="en-US"/>
+          <w14:textFill>
+            <w14:solidFill>
+              <w14:srgbClr w14:val="485970"/>
+            </w14:solidFill>
+          </w14:textFill>
+        </w:rPr>
+        <w:t xml:space="preserve">GOAT</w:t>
+      </w:r>
+      <w:r>
+        <w:rPr>
+          <w:rFonts w:ascii="Palatino" w:hAnsi="Palatino"/>
+          <w:outline w:val="0"/>
+          <w:color w:val="485970"/>
+          <w:sz w:val="21"/>
+          <w:szCs w:val="21"/>
+          <w:u w:color="485970"/>
+          <w:rtl w:val="0"/>
+          <w:lang w:val="en-US"/>
+          <w14:textFill>
+            <w14:solidFill>
+              <w14:srgbClr w14:val="485970"/>
+            </w14:solidFill>
+          </w14:textFill>
+        </w:rPr>
+        <w:t xml:space="preserve">, Los Angeles, USA </w:t>
+      </w:r>
+      <w:r>
+        <w:rPr>
+          <w:rFonts w:ascii="Palatino" w:hAnsi="Palatino" w:hint="default"/>
+          <w:outline w:val="0"/>
+          <w:color w:val="485970"/>
+          <w:sz w:val="21"/>
+          <w:szCs w:val="21"/>
+          <w:u w:color="485970"/>
+          <w:rtl w:val="0"/>
+          <w:lang w:val="en-US"/>
+          <w14:textFill>
+            <w14:solidFill>
+              <w14:srgbClr w14:val="485970"/>
+            </w14:solidFill>
+          </w14:textFill>
+        </w:rPr>
+        <w:t xml:space="preserve">• </w:t>
+      </w:r>
+      <w:r>
+        <w:rPr>
+          <w:rFonts w:ascii="Palatino" w:hAnsi="Palatino"/>
+          <w:outline w:val="0"/>
+          <w:color w:val="485970"/>
+          <w:sz w:val="21"/>
+          <w:szCs w:val="21"/>
+          <w:u w:color="485970"/>
+          <w:rtl w:val="0"/>
+          <w:lang w:val="en-US"/>
+          <w14:textFill>
+            <w14:solidFill>
+              <w14:srgbClr w14:val="485970"/>
+            </w14:solidFill>
+          </w14:textFill>
+        </w:rPr>
+        <w:t xml:space="preserve">Engineering Manager</w:t>
+      </w:r>
+      <w:r>
+        <w:rPr>
+          <w:rFonts w:ascii="Palatino" w:cs="Palatino" w:hAnsi="Palatino" w:eastAsia="Palatino"/>
+          <w:outline w:val="0"/>
+          <w:color w:val="485970"/>
+          <w:sz w:val="21"/>
+          <w:szCs w:val="21"/>
+          <w:u w:color="485970"/>
+          <w:rtl w:val="0"/>
+          <w:lang w:val="de-DE"/>
+          <w14:textFill>
+            <w14:solidFill>
+              <w14:srgbClr w14:val="485970"/>
+            </w14:solidFill>
+          </w14:textFill>
+        </w:rPr>
+        <w:tab/>
+        <w:t xml:space="preserve">2019-03-01 - 2020-04-01</w:t>
+      </w:r>
+    </w:p>
+    <w:p>
+      <w:pPr>
+        <w:pStyle w:val="Body A"/>
+        <w:tabs>
+          <w:tab w:val="right" w:pos="9360"/>
+        </w:tabs>
+        <w:spacing w:line="240" w:lineRule="auto"/>
+        <w:jc w:val="both"/>
+        <w:rPr>
+          <w:rFonts w:ascii="Calibri Light" w:cs="Calibri Light" w:hAnsi="Calibri Light" w:eastAsia="Calibri Light"/>
+          <w:outline w:val="0"/>
+          <w:color w:val="262626"/>
+          <w:sz w:val="20"/>
+          <w:szCs w:val="20"/>
+          <w:u w:color="262626"/>
+          <w14:textFill>
+            <w14:solidFill>
+              <w14:srgbClr w14:val="262626"/>
+            </w14:solidFill>
+          </w14:textFill>
+        </w:rPr>
+      </w:pPr>
+      <w:r>
+        <w:rPr>
+          <w:rFonts w:ascii="Calibri Light" w:hAnsi="Calibri Light"/>
+          <w:outline w:val="0"/>
+          <w:color w:val="262626"/>
+          <w:sz w:val="20"/>
+          <w:szCs w:val="20"/>
+          <w:u w:color="262626"/>
+          <w:rtl w:val="0"/>
+          <w:lang w:val="en-US"/>
+          <w14:textFill>
+            <w14:solidFill>
+              <w14:srgbClr w14:val="262626"/>
+            </w14:solidFill>
+          </w14:textFill>
+        </w:rPr>
+        <w:t/>
       </w:r>
     </w:p>
     <w:p>
@@ -1250,7 +1787,7 @@
             </w14:solidFill>
           </w14:textFill>
         </w:rPr>
-        <w:t xml:space="preserve">Built a landing page &amp; MVP</w:t>
+        <w:t xml:space="preserve">Lead &amp; managed a team of 12 consisting of Product/iOS/Android/Backend &amp; Mobile Engineers (Ruby/ROR/Go/Swift/Kotlin) both co-located and remote, building and successfully delivering on alias (https://apps.apple.com/us/app/id1467090341) a brand new seller focused app &amp; brand for GOAT</w:t>
       </w:r>
     </w:p>
     <w:p>
@@ -1295,7 +1832,7 @@
             </w14:solidFill>
           </w14:textFill>
         </w:rPr>
-        <w:t xml:space="preserve">Pitched to Antler &amp; was accepted into the program</w:t>
+        <w:t xml:space="preserve">Levelled up multiple employee's through goal setting/coaching and the introduction of a career matrix to add more structure/conversation points around the journey</w:t>
       </w:r>
     </w:p>
     <w:p>
@@ -1360,7 +1897,7 @@
             </w14:solidFill>
           </w14:textFill>
         </w:rPr>
-        <w:t xml:space="preserve">GOAT</w:t>
+        <w:t xml:space="preserve">Travelport Locomote</w:t>
       </w:r>
       <w:r>
         <w:rPr>
@@ -1378,7 +1915,7 @@
             </w14:solidFill>
           </w14:textFill>
         </w:rPr>
-        <w:t xml:space="preserve">, Los Angeles, USA </w:t>
+        <w:t xml:space="preserve">, Melbourne, Australia </w:t>
       </w:r>
       <w:r>
         <w:rPr>
@@ -1414,7 +1951,7 @@
             </w14:solidFill>
           </w14:textFill>
         </w:rPr>
-        <w:t xml:space="preserve">Engineering Manager</w:t>
+        <w:t xml:space="preserve">Solutions Architect</w:t>
       </w:r>
       <w:r>
         <w:rPr>
@@ -1433,7 +1970,7 @@
           </w14:textFill>
         </w:rPr>
         <w:tab/>
-        <w:t xml:space="preserve">2019-04-01 - 2020-04-01</w:t>
+        <w:t xml:space="preserve">2017-06-01 - 2018-07-01</w:t>
       </w:r>
     </w:p>
     <w:p>
@@ -1519,7 +2056,7 @@
             </w14:solidFill>
           </w14:textFill>
         </w:rPr>
-        <w:t xml:space="preserve">Lead &amp; managed a team of iOS/Android/Backend Engineers (Ruby/Go) both co-located and remote, building and successfully delivering on alias (https://apps.apple.com/us/app/id1467090341) a brand new app &amp; brand for GOAT</w:t>
+        <w:t xml:space="preserve">Pragmatically defined &amp; owned the product technology roadmap and provided architectural direction to teams through deep collaboration with product owners, QA, teams &amp; other stakeholders, roadmap artefacts were created in the form of user stories &amp; through visual language eg. UML</w:t>
       </w:r>
     </w:p>
     <w:p>
@@ -1564,186 +2101,7 @@
             </w14:solidFill>
           </w14:textFill>
         </w:rPr>
-        <w:t xml:space="preserve">Levelled up multiple employee's through goal setting/coaching and the introduction of a career matrix to add more structure/conversation points around the journey</w:t>
-      </w:r>
-    </w:p>
-    <w:p>
-      <w:pPr>
-        <w:pStyle w:val="Body A"/>
-        <w:tabs>
-          <w:tab w:val="right" w:pos="9360"/>
-        </w:tabs>
-        <w:spacing w:after="0"/>
-        <w:jc w:val="both"/>
-        <w:rPr>
-          <w:rFonts w:ascii="Calibri Light" w:cs="Calibri Light" w:hAnsi="Calibri Light" w:eastAsia="Calibri Light"/>
-          <w:outline w:val="0"/>
-          <w:color w:val="262626"/>
-          <w:sz w:val="20"/>
-          <w:szCs w:val="20"/>
-          <w:u w:color="262626"/>
-          <w14:textFill>
-            <w14:solidFill>
-              <w14:srgbClr w14:val="262626"/>
-            </w14:solidFill>
-          </w14:textFill>
-        </w:rPr>
-      </w:pPr>
-    </w:p>
-    <w:p>
-      <w:pPr>
-        <w:pStyle w:val="Body A"/>
-        <w:tabs>
-          <w:tab w:val="right" w:pos="9916"/>
-        </w:tabs>
-        <w:spacing w:line="252" w:lineRule="auto"/>
-        <w:rPr>
-          <w:rFonts w:ascii="Palatino" w:cs="Palatino" w:hAnsi="Palatino" w:eastAsia="Palatino"/>
-          <w:outline w:val="0"/>
-          <w:color w:val="485970"/>
-          <w:sz w:val="21"/>
-          <w:szCs w:val="21"/>
-          <w:u w:color="485970"/>
-          <w14:textFill>
-            <w14:solidFill>
-              <w14:srgbClr w14:val="485970"/>
-            </w14:solidFill>
-          </w14:textFill>
-        </w:rPr>
-      </w:pPr>
-      <w:r>
-        <w:rPr>
-          <w:rFonts w:ascii="Palatino" w:hAnsi="Palatino"/>
-          <w:b w:val="1"/>
-          <w:bCs w:val="1"/>
-          <w:outline w:val="0"/>
-          <w:color w:val="485970"/>
-          <w:sz w:val="21"/>
-          <w:szCs w:val="21"/>
-          <w:u w:color="485970"/>
-          <w:rtl w:val="0"/>
-          <w:lang w:val="en-US"/>
-          <w14:textFill>
-            <w14:solidFill>
-              <w14:srgbClr w14:val="485970"/>
-            </w14:solidFill>
-          </w14:textFill>
-        </w:rPr>
-        <w:t xml:space="preserve">Travelport Locomote</w:t>
-      </w:r>
-      <w:r>
-        <w:rPr>
-          <w:rFonts w:ascii="Palatino" w:hAnsi="Palatino"/>
-          <w:outline w:val="0"/>
-          <w:color w:val="485970"/>
-          <w:sz w:val="21"/>
-          <w:szCs w:val="21"/>
-          <w:u w:color="485970"/>
-          <w:rtl w:val="0"/>
-          <w:lang w:val="en-US"/>
-          <w14:textFill>
-            <w14:solidFill>
-              <w14:srgbClr w14:val="485970"/>
-            </w14:solidFill>
-          </w14:textFill>
-        </w:rPr>
-        <w:t xml:space="preserve">, Melbourne, Australia </w:t>
-      </w:r>
-      <w:r>
-        <w:rPr>
-          <w:rFonts w:ascii="Palatino" w:hAnsi="Palatino" w:hint="default"/>
-          <w:outline w:val="0"/>
-          <w:color w:val="485970"/>
-          <w:sz w:val="21"/>
-          <w:szCs w:val="21"/>
-          <w:u w:color="485970"/>
-          <w:rtl w:val="0"/>
-          <w:lang w:val="en-US"/>
-          <w14:textFill>
-            <w14:solidFill>
-              <w14:srgbClr w14:val="485970"/>
-            </w14:solidFill>
-          </w14:textFill>
-        </w:rPr>
-        <w:t xml:space="preserve">• </w:t>
-      </w:r>
-      <w:r>
-        <w:rPr>
-          <w:rFonts w:ascii="Palatino" w:hAnsi="Palatino"/>
-          <w:outline w:val="0"/>
-          <w:color w:val="485970"/>
-          <w:sz w:val="21"/>
-          <w:szCs w:val="21"/>
-          <w:u w:color="485970"/>
-          <w:rtl w:val="0"/>
-          <w:lang w:val="en-US"/>
-          <w14:textFill>
-            <w14:solidFill>
-              <w14:srgbClr w14:val="485970"/>
-            </w14:solidFill>
-          </w14:textFill>
-        </w:rPr>
-        <w:t xml:space="preserve">Solutions Architect</w:t>
-      </w:r>
-      <w:r>
-        <w:rPr>
-          <w:rFonts w:ascii="Palatino" w:cs="Palatino" w:hAnsi="Palatino" w:eastAsia="Palatino"/>
-          <w:outline w:val="0"/>
-          <w:color w:val="485970"/>
-          <w:sz w:val="21"/>
-          <w:szCs w:val="21"/>
-          <w:u w:color="485970"/>
-          <w:rtl w:val="0"/>
-          <w:lang w:val="de-DE"/>
-          <w14:textFill>
-            <w14:solidFill>
-              <w14:srgbClr w14:val="485970"/>
-            </w14:solidFill>
-          </w14:textFill>
-        </w:rPr>
-        <w:tab/>
-        <w:t xml:space="preserve">2017-06-01 - 2018-07-01</w:t>
-      </w:r>
-    </w:p>
-    <w:p>
-      <w:pPr>
-        <w:pStyle w:val="Body A"/>
-        <w:tabs>
-          <w:tab w:val="right" w:pos="9360"/>
-        </w:tabs>
-        <w:spacing w:line="240" w:lineRule="auto"/>
-        <w:jc w:val="both"/>
-        <w:rPr>
-          <w:rFonts w:ascii="Calibri Light" w:cs="Calibri Light" w:hAnsi="Calibri Light" w:eastAsia="Calibri Light"/>
-          <w:outline w:val="0"/>
-          <w:color w:val="262626"/>
-          <w:sz w:val="20"/>
-          <w:szCs w:val="20"/>
-          <w:u w:color="262626"/>
-          <w14:textFill>
-            <w14:solidFill>
-              <w14:srgbClr w14:val="262626"/>
-            </w14:solidFill>
-          </w14:textFill>
-        </w:rPr>
-      </w:pPr>
-      <w:r>
-        <w:rPr>
-          <w:rFonts w:ascii="Calibri Light" w:hAnsi="Calibri Light"/>
-          <w:outline w:val="0"/>
-          <w:color w:val="262626"/>
-          <w:sz w:val="20"/>
-          <w:szCs w:val="20"/>
-          <w:u w:color="262626"/>
-          <w:rtl w:val="0"/>
-          <w:lang w:val="en-US"/>
-          <w14:textFill>
-            <w14:solidFill>
-              <w14:srgbClr w14:val="262626"/>
-            </w14:solidFill>
-          </w14:textFill>
-        </w:rPr>
-        <w:t/>
+        <w:t xml:space="preserve">Championed key initiatives to increase release predictability &amp; reliability, reducing cycle time, reducing escaped defects through collaboration with multiple facets of the business such as management, support, sales &amp; engineering</w:t>
       </w:r>
     </w:p>
     <w:p>
@@ -1788,7 +2146,7 @@
             </w14:solidFill>
           </w14:textFill>
         </w:rPr>
-        <w:t xml:space="preserve">Pragmatically defined &amp; owned the product technology roadmap and provided architectural direction to teams through deep collaboration with product owners, QA, teams &amp; other stakeholders, roadmap artefacts were created in the form of user stories &amp; through visual language eg. UML</w:t>
+        <w:t xml:space="preserve">Selected and evangelised appropriate design and integration patterns with first/third parties &amp; processes to help scale the business through contribution to the organisation's wiki, lightning talks and pair programming / mentoring resulting in improvements to organisations engineering conceptual integrity &amp; reduced cycle time for user stories</w:t>
       </w:r>
     </w:p>
     <w:p>
@@ -1833,7 +2191,7 @@
             </w14:solidFill>
           </w14:textFill>
         </w:rPr>
-        <w:t xml:space="preserve">Championed key initiatives to increase release predictability &amp; reliability, reducing cycle time, reducing escaped defects through collaboration with multiple facets of the business such as management, support, sales &amp; engineering</w:t>
+        <w:t xml:space="preserve">Developed technical tools to aid in story visibility through the development pipeline &amp; defect tracking/resolution</w:t>
       </w:r>
     </w:p>
     <w:p>
@@ -1878,7 +2236,7 @@
             </w14:solidFill>
           </w14:textFill>
         </w:rPr>
-        <w:t xml:space="preserve">Selected and evangelised appropriate design and integration patterns with first/third parties &amp; processes to help scale the business through contribution to the organisation's wiki, lightning talks and pair programming / mentoring resulting in improvements to organisations engineering conceptual integrity &amp; reduced cycle time for user stories</w:t>
+        <w:t xml:space="preserve">Engaged in Web App &amp; Network Security, PEN Testing &amp; PCI Compliance</w:t>
       </w:r>
     </w:p>
     <w:p>
@@ -1923,7 +2281,7 @@
             </w14:solidFill>
           </w14:textFill>
         </w:rPr>
-        <w:t xml:space="preserve">Developed technical tools to aid in story visibility through the development pipeline &amp; defect tracking/resolution</w:t>
+        <w:t xml:space="preserve">Maintained a suite of apps hosting in AWS using Configuration Management (Ansible/Chef) &amp; PaaS such as Elastic Beanstalk, Heroku and containerisation using Docker</w:t>
       </w:r>
     </w:p>
     <w:p>
@@ -1968,7 +2326,7 @@
             </w14:solidFill>
           </w14:textFill>
         </w:rPr>
-        <w:t xml:space="preserve">Engaged in Web App &amp; Network Security, PEN Testing &amp; PCI Compliance</w:t>
+        <w:t xml:space="preserve">Orchestrated a zero downtime organisation wide migration to Heroku (PaaS) from Ansible/Chef managed infrastructure, this resulted in a reduced operational overhead on the engineering team &amp; direct cost saving's through a reduction in hosting costs</w:t>
       </w:r>
     </w:p>
     <w:p>
@@ -2013,7 +2371,186 @@
             </w14:solidFill>
           </w14:textFill>
         </w:rPr>
-        <w:t xml:space="preserve">Maintained a suite of apps hosting in AWS using Configuration Management (Ansible/Chef) &amp; PaaS such as Elastic Beanstalk, Heroku and containerisation using Docker</w:t>
+        <w:t xml:space="preserve">Provided direction/planning to engineering teams and collaborated with third party vendors in order to meet PCI / GDPR compliance</w:t>
+      </w:r>
+    </w:p>
+    <w:p>
+      <w:pPr>
+        <w:pStyle w:val="Body A"/>
+        <w:tabs>
+          <w:tab w:val="right" w:pos="9360"/>
+        </w:tabs>
+        <w:spacing w:after="0"/>
+        <w:jc w:val="both"/>
+        <w:rPr>
+          <w:rFonts w:ascii="Calibri Light" w:cs="Calibri Light" w:hAnsi="Calibri Light" w:eastAsia="Calibri Light"/>
+          <w:outline w:val="0"/>
+          <w:color w:val="262626"/>
+          <w:sz w:val="20"/>
+          <w:szCs w:val="20"/>
+          <w:u w:color="262626"/>
+          <w14:textFill>
+            <w14:solidFill>
+              <w14:srgbClr w14:val="262626"/>
+            </w14:solidFill>
+          </w14:textFill>
+        </w:rPr>
+      </w:pPr>
+    </w:p>
+    <w:p>
+      <w:pPr>
+        <w:pStyle w:val="Body A"/>
+        <w:tabs>
+          <w:tab w:val="right" w:pos="9916"/>
+        </w:tabs>
+        <w:spacing w:line="252" w:lineRule="auto"/>
+        <w:rPr>
+          <w:rFonts w:ascii="Palatino" w:cs="Palatino" w:hAnsi="Palatino" w:eastAsia="Palatino"/>
+          <w:outline w:val="0"/>
+          <w:color w:val="485970"/>
+          <w:sz w:val="21"/>
+          <w:szCs w:val="21"/>
+          <w:u w:color="485970"/>
+          <w14:textFill>
+            <w14:solidFill>
+              <w14:srgbClr w14:val="485970"/>
+            </w14:solidFill>
+          </w14:textFill>
+        </w:rPr>
+      </w:pPr>
+      <w:r>
+        <w:rPr>
+          <w:rFonts w:ascii="Palatino" w:hAnsi="Palatino"/>
+          <w:b w:val="1"/>
+          <w:bCs w:val="1"/>
+          <w:outline w:val="0"/>
+          <w:color w:val="485970"/>
+          <w:sz w:val="21"/>
+          <w:szCs w:val="21"/>
+          <w:u w:color="485970"/>
+          <w:rtl w:val="0"/>
+          <w:lang w:val="en-US"/>
+          <w14:textFill>
+            <w14:solidFill>
+              <w14:srgbClr w14:val="485970"/>
+            </w14:solidFill>
+          </w14:textFill>
+        </w:rPr>
+        <w:t xml:space="preserve">Travelport Locomote</w:t>
+      </w:r>
+      <w:r>
+        <w:rPr>
+          <w:rFonts w:ascii="Palatino" w:hAnsi="Palatino"/>
+          <w:outline w:val="0"/>
+          <w:color w:val="485970"/>
+          <w:sz w:val="21"/>
+          <w:szCs w:val="21"/>
+          <w:u w:color="485970"/>
+          <w:rtl w:val="0"/>
+          <w:lang w:val="en-US"/>
+          <w14:textFill>
+            <w14:solidFill>
+              <w14:srgbClr w14:val="485970"/>
+            </w14:solidFill>
+          </w14:textFill>
+        </w:rPr>
+        <w:t xml:space="preserve">, Melbourne, Australia </w:t>
+      </w:r>
+      <w:r>
+        <w:rPr>
+          <w:rFonts w:ascii="Palatino" w:hAnsi="Palatino" w:hint="default"/>
+          <w:outline w:val="0"/>
+          <w:color w:val="485970"/>
+          <w:sz w:val="21"/>
+          <w:szCs w:val="21"/>
+          <w:u w:color="485970"/>
+          <w:rtl w:val="0"/>
+          <w:lang w:val="en-US"/>
+          <w14:textFill>
+            <w14:solidFill>
+              <w14:srgbClr w14:val="485970"/>
+            </w14:solidFill>
+          </w14:textFill>
+        </w:rPr>
+        <w:t xml:space="preserve">• </w:t>
+      </w:r>
+      <w:r>
+        <w:rPr>
+          <w:rFonts w:ascii="Palatino" w:hAnsi="Palatino"/>
+          <w:outline w:val="0"/>
+          <w:color w:val="485970"/>
+          <w:sz w:val="21"/>
+          <w:szCs w:val="21"/>
+          <w:u w:color="485970"/>
+          <w:rtl w:val="0"/>
+          <w:lang w:val="en-US"/>
+          <w14:textFill>
+            <w14:solidFill>
+              <w14:srgbClr w14:val="485970"/>
+            </w14:solidFill>
+          </w14:textFill>
+        </w:rPr>
+        <w:t xml:space="preserve">Engineering Manager and Technical Product Owner</w:t>
+      </w:r>
+      <w:r>
+        <w:rPr>
+          <w:rFonts w:ascii="Palatino" w:cs="Palatino" w:hAnsi="Palatino" w:eastAsia="Palatino"/>
+          <w:outline w:val="0"/>
+          <w:color w:val="485970"/>
+          <w:sz w:val="21"/>
+          <w:szCs w:val="21"/>
+          <w:u w:color="485970"/>
+          <w:rtl w:val="0"/>
+          <w:lang w:val="de-DE"/>
+          <w14:textFill>
+            <w14:solidFill>
+              <w14:srgbClr w14:val="485970"/>
+            </w14:solidFill>
+          </w14:textFill>
+        </w:rPr>
+        <w:tab/>
+        <w:t xml:space="preserve">2014-06-01 - 2017-06-01</w:t>
+      </w:r>
+    </w:p>
+    <w:p>
+      <w:pPr>
+        <w:pStyle w:val="Body A"/>
+        <w:tabs>
+          <w:tab w:val="right" w:pos="9360"/>
+        </w:tabs>
+        <w:spacing w:line="240" w:lineRule="auto"/>
+        <w:jc w:val="both"/>
+        <w:rPr>
+          <w:rFonts w:ascii="Calibri Light" w:cs="Calibri Light" w:hAnsi="Calibri Light" w:eastAsia="Calibri Light"/>
+          <w:outline w:val="0"/>
+          <w:color w:val="262626"/>
+          <w:sz w:val="20"/>
+          <w:szCs w:val="20"/>
+          <w:u w:color="262626"/>
+          <w14:textFill>
+            <w14:solidFill>
+              <w14:srgbClr w14:val="262626"/>
+            </w14:solidFill>
+          </w14:textFill>
+        </w:rPr>
+      </w:pPr>
+      <w:r>
+        <w:rPr>
+          <w:rFonts w:ascii="Calibri Light" w:hAnsi="Calibri Light"/>
+          <w:outline w:val="0"/>
+          <w:color w:val="262626"/>
+          <w:sz w:val="20"/>
+          <w:szCs w:val="20"/>
+          <w:u w:color="262626"/>
+          <w:rtl w:val="0"/>
+          <w:lang w:val="en-US"/>
+          <w14:textFill>
+            <w14:solidFill>
+              <w14:srgbClr w14:val="262626"/>
+            </w14:solidFill>
+          </w14:textFill>
+        </w:rPr>
+        <w:t/>
       </w:r>
     </w:p>
     <w:p>
@@ -2058,7 +2595,7 @@
             </w14:solidFill>
           </w14:textFill>
         </w:rPr>
-        <w:t xml:space="preserve">Orchestrated a zero downtime organisation wide migration to Heroku (PaaS) from Ansible/Chef managed infrastructure, this resulted in a reduced operational overhead on the engineering team &amp; direct cost saving's through a reduction in hosting costs</w:t>
+        <w:t xml:space="preserve">Recruited and managed high-performing scrum teams of 6-8 members during a significant growth phase, partnering with local and international recruiters to expand the workforce from 20 to 50 employees</w:t>
       </w:r>
     </w:p>
     <w:p>
@@ -2103,186 +2640,7 @@
             </w14:solidFill>
           </w14:textFill>
         </w:rPr>
-        <w:t xml:space="preserve">Provided direction/planning to engineering teams and collaborated with third party vendors in order to meet PCI / GDPR compliance</w:t>
-      </w:r>
-    </w:p>
-    <w:p>
-      <w:pPr>
-        <w:pStyle w:val="Body A"/>
-        <w:tabs>
-          <w:tab w:val="right" w:pos="9360"/>
-        </w:tabs>
-        <w:spacing w:after="0"/>
-        <w:jc w:val="both"/>
-        <w:rPr>
-          <w:rFonts w:ascii="Calibri Light" w:cs="Calibri Light" w:hAnsi="Calibri Light" w:eastAsia="Calibri Light"/>
-          <w:outline w:val="0"/>
-          <w:color w:val="262626"/>
-          <w:sz w:val="20"/>
-          <w:szCs w:val="20"/>
-          <w:u w:color="262626"/>
-          <w14:textFill>
-            <w14:solidFill>
-              <w14:srgbClr w14:val="262626"/>
-            </w14:solidFill>
-          </w14:textFill>
-        </w:rPr>
-      </w:pPr>
-    </w:p>
-    <w:p>
-      <w:pPr>
-        <w:pStyle w:val="Body A"/>
-        <w:tabs>
-          <w:tab w:val="right" w:pos="9916"/>
-        </w:tabs>
-        <w:spacing w:line="252" w:lineRule="auto"/>
-        <w:rPr>
-          <w:rFonts w:ascii="Palatino" w:cs="Palatino" w:hAnsi="Palatino" w:eastAsia="Palatino"/>
-          <w:outline w:val="0"/>
-          <w:color w:val="485970"/>
-          <w:sz w:val="21"/>
-          <w:szCs w:val="21"/>
-          <w:u w:color="485970"/>
-          <w14:textFill>
-            <w14:solidFill>
-              <w14:srgbClr w14:val="485970"/>
-            </w14:solidFill>
-          </w14:textFill>
-        </w:rPr>
-      </w:pPr>
-      <w:r>
-        <w:rPr>
-          <w:rFonts w:ascii="Palatino" w:hAnsi="Palatino"/>
-          <w:b w:val="1"/>
-          <w:bCs w:val="1"/>
-          <w:outline w:val="0"/>
-          <w:color w:val="485970"/>
-          <w:sz w:val="21"/>
-          <w:szCs w:val="21"/>
-          <w:u w:color="485970"/>
-          <w:rtl w:val="0"/>
-          <w:lang w:val="en-US"/>
-          <w14:textFill>
-            <w14:solidFill>
-              <w14:srgbClr w14:val="485970"/>
-            </w14:solidFill>
-          </w14:textFill>
-        </w:rPr>
-        <w:t xml:space="preserve">Travelport Locomote</w:t>
-      </w:r>
-      <w:r>
-        <w:rPr>
-          <w:rFonts w:ascii="Palatino" w:hAnsi="Palatino"/>
-          <w:outline w:val="0"/>
-          <w:color w:val="485970"/>
-          <w:sz w:val="21"/>
-          <w:szCs w:val="21"/>
-          <w:u w:color="485970"/>
-          <w:rtl w:val="0"/>
-          <w:lang w:val="en-US"/>
-          <w14:textFill>
-            <w14:solidFill>
-              <w14:srgbClr w14:val="485970"/>
-            </w14:solidFill>
-          </w14:textFill>
-        </w:rPr>
-        <w:t xml:space="preserve">, Melbourne, Australia </w:t>
-      </w:r>
-      <w:r>
-        <w:rPr>
-          <w:rFonts w:ascii="Palatino" w:hAnsi="Palatino" w:hint="default"/>
-          <w:outline w:val="0"/>
-          <w:color w:val="485970"/>
-          <w:sz w:val="21"/>
-          <w:szCs w:val="21"/>
-          <w:u w:color="485970"/>
-          <w:rtl w:val="0"/>
-          <w:lang w:val="en-US"/>
-          <w14:textFill>
-            <w14:solidFill>
-              <w14:srgbClr w14:val="485970"/>
-            </w14:solidFill>
-          </w14:textFill>
-        </w:rPr>
-        <w:t xml:space="preserve">• </w:t>
-      </w:r>
-      <w:r>
-        <w:rPr>
-          <w:rFonts w:ascii="Palatino" w:hAnsi="Palatino"/>
-          <w:outline w:val="0"/>
-          <w:color w:val="485970"/>
-          <w:sz w:val="21"/>
-          <w:szCs w:val="21"/>
-          <w:u w:color="485970"/>
-          <w:rtl w:val="0"/>
-          <w:lang w:val="en-US"/>
-          <w14:textFill>
-            <w14:solidFill>
-              <w14:srgbClr w14:val="485970"/>
-            </w14:solidFill>
-          </w14:textFill>
-        </w:rPr>
-        <w:t xml:space="preserve">Engineering Manager and Technical Product Owner</w:t>
-      </w:r>
-      <w:r>
-        <w:rPr>
-          <w:rFonts w:ascii="Palatino" w:cs="Palatino" w:hAnsi="Palatino" w:eastAsia="Palatino"/>
-          <w:outline w:val="0"/>
-          <w:color w:val="485970"/>
-          <w:sz w:val="21"/>
-          <w:szCs w:val="21"/>
-          <w:u w:color="485970"/>
-          <w:rtl w:val="0"/>
-          <w:lang w:val="de-DE"/>
-          <w14:textFill>
-            <w14:solidFill>
-              <w14:srgbClr w14:val="485970"/>
-            </w14:solidFill>
-          </w14:textFill>
-        </w:rPr>
-        <w:tab/>
-        <w:t xml:space="preserve">2014-06-01 - 2017-06-01</w:t>
-      </w:r>
-    </w:p>
-    <w:p>
-      <w:pPr>
-        <w:pStyle w:val="Body A"/>
-        <w:tabs>
-          <w:tab w:val="right" w:pos="9360"/>
-        </w:tabs>
-        <w:spacing w:line="240" w:lineRule="auto"/>
-        <w:jc w:val="both"/>
-        <w:rPr>
-          <w:rFonts w:ascii="Calibri Light" w:cs="Calibri Light" w:hAnsi="Calibri Light" w:eastAsia="Calibri Light"/>
-          <w:outline w:val="0"/>
-          <w:color w:val="262626"/>
-          <w:sz w:val="20"/>
-          <w:szCs w:val="20"/>
-          <w:u w:color="262626"/>
-          <w14:textFill>
-            <w14:solidFill>
-              <w14:srgbClr w14:val="262626"/>
-            </w14:solidFill>
-          </w14:textFill>
-        </w:rPr>
-      </w:pPr>
-      <w:r>
-        <w:rPr>
-          <w:rFonts w:ascii="Calibri Light" w:hAnsi="Calibri Light"/>
-          <w:outline w:val="0"/>
-          <w:color w:val="262626"/>
-          <w:sz w:val="20"/>
-          <w:szCs w:val="20"/>
-          <w:u w:color="262626"/>
-          <w:rtl w:val="0"/>
-          <w:lang w:val="en-US"/>
-          <w14:textFill>
-            <w14:solidFill>
-              <w14:srgbClr w14:val="262626"/>
-            </w14:solidFill>
-          </w14:textFill>
-        </w:rPr>
-        <w:t/>
+        <w:t xml:space="preserve">Worked closely with clients/customers to ensure customer requirements were converted into high quality development artefacts for teams</w:t>
       </w:r>
     </w:p>
     <w:p>
@@ -2327,7 +2685,7 @@
             </w14:solidFill>
           </w14:textFill>
         </w:rPr>
-        <w:t xml:space="preserve">Built, hired &amp; lead scrum teams of 6-8 as a servant leader both domestically and remotely, worked closely with recruiters both locally &amp; abroad during a growth period of 20-to 50 employee's</w:t>
+        <w:t xml:space="preserve">Delivered on the product roadmap &amp; on-boarded some of Australia's biggest universities</w:t>
       </w:r>
     </w:p>
     <w:p>
@@ -2372,7 +2730,7 @@
             </w14:solidFill>
           </w14:textFill>
         </w:rPr>
-        <w:t xml:space="preserve">Worked closely with clients/customers to ensure customer requirements were converted into high quality development artefacts for teams</w:t>
+        <w:t xml:space="preserve">Formulated &amp; articulated the vision and goals to scrum teams to ensure alignment/shared understanding through story mapping sessions, five whys, kick off's, pair programming &amp; mentoring</w:t>
       </w:r>
     </w:p>
     <w:p>
@@ -2417,7 +2775,7 @@
             </w14:solidFill>
           </w14:textFill>
         </w:rPr>
-        <w:t xml:space="preserve">Delivered on the product roadmap &amp; on-boarded some of Australia's biggest universities</w:t>
+        <w:t xml:space="preserve">Engaged in application performance, load &amp; stress testing and implemented appropriate infrastructure and processes to support a 10x growth in on-boarded companies</w:t>
       </w:r>
     </w:p>
     <w:p>
@@ -2462,7 +2820,7 @@
             </w14:solidFill>
           </w14:textFill>
         </w:rPr>
-        <w:t xml:space="preserve">Formulated &amp; articulated the vision and goals to scrum teams to ensure alignment/shared understanding through story mapping sessions, five whys, kick off's, pair programming &amp; mentoring</w:t>
+        <w:t xml:space="preserve">Implemented/improved many technical and operational procedures and processes to facilitate scaling the business such as streamlining/automating the support, implementation &amp; development pipelines with a constant emphasis on continuous improvement</w:t>
       </w:r>
     </w:p>
     <w:p>
@@ -2507,7 +2865,7 @@
             </w14:solidFill>
           </w14:textFill>
         </w:rPr>
-        <w:t xml:space="preserve">Engaged in application performance, load &amp; stress testing and implemented appropriate infrastructure and processes to support a 10x growth in on-boarded companies</w:t>
+        <w:t xml:space="preserve">Improved backlog priority transparency &amp; stability through sequencing using a very simple cost/value weighting, it was previously ordered via the HiPPO method which wasn't scaling</w:t>
       </w:r>
     </w:p>
     <w:p>
@@ -2552,7 +2910,7 @@
             </w14:solidFill>
           </w14:textFill>
         </w:rPr>
-        <w:t xml:space="preserve">Implemented/improved many technical and operational procedures and processes to facilitate scaling the business such as streamlining/automating the support, implementation &amp; development pipelines with a constant emphasis on continuous improvement</w:t>
+        <w:t xml:space="preserve">Identified key unique selling points, key features and competitive advantages through user, sales feedback and competitor analysis within the market and crafted user stories to guide product development</w:t>
       </w:r>
     </w:p>
     <w:p>
@@ -2597,7 +2955,7 @@
             </w14:solidFill>
           </w14:textFill>
         </w:rPr>
-        <w:t xml:space="preserve">Improved backlog priority transparency &amp; stability through sequencing using a very simple cost/value weighting, it was previously ordered via the HiPPO method which wasn't scaling</w:t>
+        <w:t xml:space="preserve">Guided product decisions through empiricism primarily through the build, measure lean feedback loop</w:t>
       </w:r>
     </w:p>
     <w:p>
@@ -2642,7 +3000,7 @@
             </w14:solidFill>
           </w14:textFill>
         </w:rPr>
-        <w:t xml:space="preserve">Identified key unique selling points, key features and competitive advantages through user, sales feedback and competitor analysis within the market and crafted user stories to guide product development</w:t>
+        <w:t xml:space="preserve">Advocated a product strategy of saying "no" more than "yes" on the back of maintaining integrity of our product vision</w:t>
       </w:r>
     </w:p>
     <w:p>
@@ -2687,7 +3045,7 @@
             </w14:solidFill>
           </w14:textFill>
         </w:rPr>
-        <w:t xml:space="preserve">Guided product decisions through empiricism primarily through the build, measure lean feedback loop</w:t>
+        <w:t xml:space="preserve">Supported and collaborated with third parties through due diligence as part of an acquisition</w:t>
       </w:r>
     </w:p>
     <w:p>
@@ -2732,7 +3090,186 @@
             </w14:solidFill>
           </w14:textFill>
         </w:rPr>
-        <w:t xml:space="preserve">Advocated a product strategy of saying "no" more than "yes" on the back of maintaining integrity of our product vision</w:t>
+        <w:t xml:space="preserve">Engaged in annual &amp; successful PEN Test &amp; Security audits of the application for one of Australia's leading banks</w:t>
+      </w:r>
+    </w:p>
+    <w:p>
+      <w:pPr>
+        <w:pStyle w:val="Body A"/>
+        <w:tabs>
+          <w:tab w:val="right" w:pos="9360"/>
+        </w:tabs>
+        <w:spacing w:after="0"/>
+        <w:jc w:val="both"/>
+        <w:rPr>
+          <w:rFonts w:ascii="Calibri Light" w:cs="Calibri Light" w:hAnsi="Calibri Light" w:eastAsia="Calibri Light"/>
+          <w:outline w:val="0"/>
+          <w:color w:val="262626"/>
+          <w:sz w:val="20"/>
+          <w:szCs w:val="20"/>
+          <w:u w:color="262626"/>
+          <w14:textFill>
+            <w14:solidFill>
+              <w14:srgbClr w14:val="262626"/>
+            </w14:solidFill>
+          </w14:textFill>
+        </w:rPr>
+      </w:pPr>
+    </w:p>
+    <w:p>
+      <w:pPr>
+        <w:pStyle w:val="Body A"/>
+        <w:tabs>
+          <w:tab w:val="right" w:pos="9916"/>
+        </w:tabs>
+        <w:spacing w:line="252" w:lineRule="auto"/>
+        <w:rPr>
+          <w:rFonts w:ascii="Palatino" w:cs="Palatino" w:hAnsi="Palatino" w:eastAsia="Palatino"/>
+          <w:outline w:val="0"/>
+          <w:color w:val="485970"/>
+          <w:sz w:val="21"/>
+          <w:szCs w:val="21"/>
+          <w:u w:color="485970"/>
+          <w14:textFill>
+            <w14:solidFill>
+              <w14:srgbClr w14:val="485970"/>
+            </w14:solidFill>
+          </w14:textFill>
+        </w:rPr>
+      </w:pPr>
+      <w:r>
+        <w:rPr>
+          <w:rFonts w:ascii="Palatino" w:hAnsi="Palatino"/>
+          <w:b w:val="1"/>
+          <w:bCs w:val="1"/>
+          <w:outline w:val="0"/>
+          <w:color w:val="485970"/>
+          <w:sz w:val="21"/>
+          <w:szCs w:val="21"/>
+          <w:u w:color="485970"/>
+          <w:rtl w:val="0"/>
+          <w:lang w:val="en-US"/>
+          <w14:textFill>
+            <w14:solidFill>
+              <w14:srgbClr w14:val="485970"/>
+            </w14:solidFill>
+          </w14:textFill>
+        </w:rPr>
+        <w:t xml:space="preserve">Travelport Locomote</w:t>
+      </w:r>
+      <w:r>
+        <w:rPr>
+          <w:rFonts w:ascii="Palatino" w:hAnsi="Palatino"/>
+          <w:outline w:val="0"/>
+          <w:color w:val="485970"/>
+          <w:sz w:val="21"/>
+          <w:szCs w:val="21"/>
+          <w:u w:color="485970"/>
+          <w:rtl w:val="0"/>
+          <w:lang w:val="en-US"/>
+          <w14:textFill>
+            <w14:solidFill>
+              <w14:srgbClr w14:val="485970"/>
+            </w14:solidFill>
+          </w14:textFill>
+        </w:rPr>
+        <w:t xml:space="preserve">, Melbourne, Australia </w:t>
+      </w:r>
+      <w:r>
+        <w:rPr>
+          <w:rFonts w:ascii="Palatino" w:hAnsi="Palatino" w:hint="default"/>
+          <w:outline w:val="0"/>
+          <w:color w:val="485970"/>
+          <w:sz w:val="21"/>
+          <w:szCs w:val="21"/>
+          <w:u w:color="485970"/>
+          <w:rtl w:val="0"/>
+          <w:lang w:val="en-US"/>
+          <w14:textFill>
+            <w14:solidFill>
+              <w14:srgbClr w14:val="485970"/>
+            </w14:solidFill>
+          </w14:textFill>
+        </w:rPr>
+        <w:t xml:space="preserve">• </w:t>
+      </w:r>
+      <w:r>
+        <w:rPr>
+          <w:rFonts w:ascii="Palatino" w:hAnsi="Palatino"/>
+          <w:outline w:val="0"/>
+          <w:color w:val="485970"/>
+          <w:sz w:val="21"/>
+          <w:szCs w:val="21"/>
+          <w:u w:color="485970"/>
+          <w:rtl w:val="0"/>
+          <w:lang w:val="en-US"/>
+          <w14:textFill>
+            <w14:solidFill>
+              <w14:srgbClr w14:val="485970"/>
+            </w14:solidFill>
+          </w14:textFill>
+        </w:rPr>
+        <w:t xml:space="preserve">Engineering Team Lead</w:t>
+      </w:r>
+      <w:r>
+        <w:rPr>
+          <w:rFonts w:ascii="Palatino" w:cs="Palatino" w:hAnsi="Palatino" w:eastAsia="Palatino"/>
+          <w:outline w:val="0"/>
+          <w:color w:val="485970"/>
+          <w:sz w:val="21"/>
+          <w:szCs w:val="21"/>
+          <w:u w:color="485970"/>
+          <w:rtl w:val="0"/>
+          <w:lang w:val="de-DE"/>
+          <w14:textFill>
+            <w14:solidFill>
+              <w14:srgbClr w14:val="485970"/>
+            </w14:solidFill>
+          </w14:textFill>
+        </w:rPr>
+        <w:tab/>
+        <w:t xml:space="preserve">2012-07-01 - 2014-06-01</w:t>
+      </w:r>
+    </w:p>
+    <w:p>
+      <w:pPr>
+        <w:pStyle w:val="Body A"/>
+        <w:tabs>
+          <w:tab w:val="right" w:pos="9360"/>
+        </w:tabs>
+        <w:spacing w:line="240" w:lineRule="auto"/>
+        <w:jc w:val="both"/>
+        <w:rPr>
+          <w:rFonts w:ascii="Calibri Light" w:cs="Calibri Light" w:hAnsi="Calibri Light" w:eastAsia="Calibri Light"/>
+          <w:outline w:val="0"/>
+          <w:color w:val="262626"/>
+          <w:sz w:val="20"/>
+          <w:szCs w:val="20"/>
+          <w:u w:color="262626"/>
+          <w14:textFill>
+            <w14:solidFill>
+              <w14:srgbClr w14:val="262626"/>
+            </w14:solidFill>
+          </w14:textFill>
+        </w:rPr>
+      </w:pPr>
+      <w:r>
+        <w:rPr>
+          <w:rFonts w:ascii="Calibri Light" w:hAnsi="Calibri Light"/>
+          <w:outline w:val="0"/>
+          <w:color w:val="262626"/>
+          <w:sz w:val="20"/>
+          <w:szCs w:val="20"/>
+          <w:u w:color="262626"/>
+          <w:rtl w:val="0"/>
+          <w:lang w:val="en-US"/>
+          <w14:textFill>
+            <w14:solidFill>
+              <w14:srgbClr w14:val="262626"/>
+            </w14:solidFill>
+          </w14:textFill>
+        </w:rPr>
+        <w:t/>
       </w:r>
     </w:p>
     <w:p>
@@ -2777,7 +3314,7 @@
             </w14:solidFill>
           </w14:textFill>
         </w:rPr>
-        <w:t xml:space="preserve">Supported and collaborated with third parties through due diligence as part of an acquisition</w:t>
+        <w:t xml:space="preserve">Built &amp; Lead a scrum team of 6-8 both domestically and remotely</w:t>
       </w:r>
     </w:p>
     <w:p>
@@ -2822,186 +3359,7 @@
             </w14:solidFill>
           </w14:textFill>
         </w:rPr>
-        <w:t xml:space="preserve">Engaged in annual &amp; successful PEN Test &amp; Security audits of the application for one of Australia's leading banks</w:t>
-      </w:r>
-    </w:p>
-    <w:p>
-      <w:pPr>
-        <w:pStyle w:val="Body A"/>
-        <w:tabs>
-          <w:tab w:val="right" w:pos="9360"/>
-        </w:tabs>
-        <w:spacing w:after="0"/>
-        <w:jc w:val="both"/>
-        <w:rPr>
-          <w:rFonts w:ascii="Calibri Light" w:cs="Calibri Light" w:hAnsi="Calibri Light" w:eastAsia="Calibri Light"/>
-          <w:outline w:val="0"/>
-          <w:color w:val="262626"/>
-          <w:sz w:val="20"/>
-          <w:szCs w:val="20"/>
-          <w:u w:color="262626"/>
-          <w14:textFill>
-            <w14:solidFill>
-              <w14:srgbClr w14:val="262626"/>
-            </w14:solidFill>
-          </w14:textFill>
-        </w:rPr>
-      </w:pPr>
-    </w:p>
-    <w:p>
-      <w:pPr>
-        <w:pStyle w:val="Body A"/>
-        <w:tabs>
-          <w:tab w:val="right" w:pos="9916"/>
-        </w:tabs>
-        <w:spacing w:line="252" w:lineRule="auto"/>
-        <w:rPr>
-          <w:rFonts w:ascii="Palatino" w:cs="Palatino" w:hAnsi="Palatino" w:eastAsia="Palatino"/>
-          <w:outline w:val="0"/>
-          <w:color w:val="485970"/>
-          <w:sz w:val="21"/>
-          <w:szCs w:val="21"/>
-          <w:u w:color="485970"/>
-          <w14:textFill>
-            <w14:solidFill>
-              <w14:srgbClr w14:val="485970"/>
-            </w14:solidFill>
-          </w14:textFill>
-        </w:rPr>
-      </w:pPr>
-      <w:r>
-        <w:rPr>
-          <w:rFonts w:ascii="Palatino" w:hAnsi="Palatino"/>
-          <w:b w:val="1"/>
-          <w:bCs w:val="1"/>
-          <w:outline w:val="0"/>
-          <w:color w:val="485970"/>
-          <w:sz w:val="21"/>
-          <w:szCs w:val="21"/>
-          <w:u w:color="485970"/>
-          <w:rtl w:val="0"/>
-          <w:lang w:val="en-US"/>
-          <w14:textFill>
-            <w14:solidFill>
-              <w14:srgbClr w14:val="485970"/>
-            </w14:solidFill>
-          </w14:textFill>
-        </w:rPr>
-        <w:t xml:space="preserve">Travelport Locomote</w:t>
-      </w:r>
-      <w:r>
-        <w:rPr>
-          <w:rFonts w:ascii="Palatino" w:hAnsi="Palatino"/>
-          <w:outline w:val="0"/>
-          <w:color w:val="485970"/>
-          <w:sz w:val="21"/>
-          <w:szCs w:val="21"/>
-          <w:u w:color="485970"/>
-          <w:rtl w:val="0"/>
-          <w:lang w:val="en-US"/>
-          <w14:textFill>
-            <w14:solidFill>
-              <w14:srgbClr w14:val="485970"/>
-            </w14:solidFill>
-          </w14:textFill>
-        </w:rPr>
-        <w:t xml:space="preserve">, Melbourne, Australia </w:t>
-      </w:r>
-      <w:r>
-        <w:rPr>
-          <w:rFonts w:ascii="Palatino" w:hAnsi="Palatino" w:hint="default"/>
-          <w:outline w:val="0"/>
-          <w:color w:val="485970"/>
-          <w:sz w:val="21"/>
-          <w:szCs w:val="21"/>
-          <w:u w:color="485970"/>
-          <w:rtl w:val="0"/>
-          <w:lang w:val="en-US"/>
-          <w14:textFill>
-            <w14:solidFill>
-              <w14:srgbClr w14:val="485970"/>
-            </w14:solidFill>
-          </w14:textFill>
-        </w:rPr>
-        <w:t xml:space="preserve">• </w:t>
-      </w:r>
-      <w:r>
-        <w:rPr>
-          <w:rFonts w:ascii="Palatino" w:hAnsi="Palatino"/>
-          <w:outline w:val="0"/>
-          <w:color w:val="485970"/>
-          <w:sz w:val="21"/>
-          <w:szCs w:val="21"/>
-          <w:u w:color="485970"/>
-          <w:rtl w:val="0"/>
-          <w:lang w:val="en-US"/>
-          <w14:textFill>
-            <w14:solidFill>
-              <w14:srgbClr w14:val="485970"/>
-            </w14:solidFill>
-          </w14:textFill>
-        </w:rPr>
-        <w:t xml:space="preserve">Engineering Team Lead</w:t>
-      </w:r>
-      <w:r>
-        <w:rPr>
-          <w:rFonts w:ascii="Palatino" w:cs="Palatino" w:hAnsi="Palatino" w:eastAsia="Palatino"/>
-          <w:outline w:val="0"/>
-          <w:color w:val="485970"/>
-          <w:sz w:val="21"/>
-          <w:szCs w:val="21"/>
-          <w:u w:color="485970"/>
-          <w:rtl w:val="0"/>
-          <w:lang w:val="de-DE"/>
-          <w14:textFill>
-            <w14:solidFill>
-              <w14:srgbClr w14:val="485970"/>
-            </w14:solidFill>
-          </w14:textFill>
-        </w:rPr>
-        <w:tab/>
-        <w:t xml:space="preserve">2012-07-01 - 2014-06-01</w:t>
-      </w:r>
-    </w:p>
-    <w:p>
-      <w:pPr>
-        <w:pStyle w:val="Body A"/>
-        <w:tabs>
-          <w:tab w:val="right" w:pos="9360"/>
-        </w:tabs>
-        <w:spacing w:line="240" w:lineRule="auto"/>
-        <w:jc w:val="both"/>
-        <w:rPr>
-          <w:rFonts w:ascii="Calibri Light" w:cs="Calibri Light" w:hAnsi="Calibri Light" w:eastAsia="Calibri Light"/>
-          <w:outline w:val="0"/>
-          <w:color w:val="262626"/>
-          <w:sz w:val="20"/>
-          <w:szCs w:val="20"/>
-          <w:u w:color="262626"/>
-          <w14:textFill>
-            <w14:solidFill>
-              <w14:srgbClr w14:val="262626"/>
-            </w14:solidFill>
-          </w14:textFill>
-        </w:rPr>
-      </w:pPr>
-      <w:r>
-        <w:rPr>
-          <w:rFonts w:ascii="Calibri Light" w:hAnsi="Calibri Light"/>
-          <w:outline w:val="0"/>
-          <w:color w:val="262626"/>
-          <w:sz w:val="20"/>
-          <w:szCs w:val="20"/>
-          <w:u w:color="262626"/>
-          <w:rtl w:val="0"/>
-          <w:lang w:val="en-US"/>
-          <w14:textFill>
-            <w14:solidFill>
-              <w14:srgbClr w14:val="262626"/>
-            </w14:solidFill>
-          </w14:textFill>
-        </w:rPr>
-        <w:t/>
+        <w:t xml:space="preserve">Guided team development efforts towards many successful project deliveries</w:t>
       </w:r>
     </w:p>
     <w:p>
@@ -3046,7 +3404,7 @@
             </w14:solidFill>
           </w14:textFill>
         </w:rPr>
-        <w:t xml:space="preserve">Built &amp; Lead a scrum team of 6-8 both domestically and remotely</w:t>
+        <w:t xml:space="preserve">Provided technical leadership to teammates through individual contribution, coaching and mentorship</w:t>
       </w:r>
     </w:p>
     <w:p>
@@ -3091,7 +3449,7 @@
             </w14:solidFill>
           </w14:textFill>
         </w:rPr>
-        <w:t xml:space="preserve">Guided team development efforts towards many successful project deliveries</w:t>
+        <w:t xml:space="preserve">On boarded &amp; Collaborated with some of Australia's leading banks and universities</w:t>
       </w:r>
     </w:p>
     <w:p>
@@ -3136,7 +3494,7 @@
             </w14:solidFill>
           </w14:textFill>
         </w:rPr>
-        <w:t xml:space="preserve">Provided technical leadership to teammates through individual contribution, coaching and mentorship</w:t>
+        <w:t xml:space="preserve">Built &amp; Nurtured a positive &amp; much lauded working culture</w:t>
       </w:r>
     </w:p>
     <w:p>
@@ -3181,7 +3539,186 @@
             </w14:solidFill>
           </w14:textFill>
         </w:rPr>
-        <w:t xml:space="preserve">On boarded &amp; Collaborated with some of Australia's leading banks and universities</w:t>
+        <w:t xml:space="preserve">Implemented/maintained best practice Continuous Integration/Continuous Delivery/Test Automation &amp; Deployment pipelines</w:t>
+      </w:r>
+    </w:p>
+    <w:p>
+      <w:pPr>
+        <w:pStyle w:val="Body A"/>
+        <w:tabs>
+          <w:tab w:val="right" w:pos="9360"/>
+        </w:tabs>
+        <w:spacing w:after="0"/>
+        <w:jc w:val="both"/>
+        <w:rPr>
+          <w:rFonts w:ascii="Calibri Light" w:cs="Calibri Light" w:hAnsi="Calibri Light" w:eastAsia="Calibri Light"/>
+          <w:outline w:val="0"/>
+          <w:color w:val="262626"/>
+          <w:sz w:val="20"/>
+          <w:szCs w:val="20"/>
+          <w:u w:color="262626"/>
+          <w14:textFill>
+            <w14:solidFill>
+              <w14:srgbClr w14:val="262626"/>
+            </w14:solidFill>
+          </w14:textFill>
+        </w:rPr>
+      </w:pPr>
+    </w:p>
+    <w:p>
+      <w:pPr>
+        <w:pStyle w:val="Body A"/>
+        <w:tabs>
+          <w:tab w:val="right" w:pos="9916"/>
+        </w:tabs>
+        <w:spacing w:line="252" w:lineRule="auto"/>
+        <w:rPr>
+          <w:rFonts w:ascii="Palatino" w:cs="Palatino" w:hAnsi="Palatino" w:eastAsia="Palatino"/>
+          <w:outline w:val="0"/>
+          <w:color w:val="485970"/>
+          <w:sz w:val="21"/>
+          <w:szCs w:val="21"/>
+          <w:u w:color="485970"/>
+          <w14:textFill>
+            <w14:solidFill>
+              <w14:srgbClr w14:val="485970"/>
+            </w14:solidFill>
+          </w14:textFill>
+        </w:rPr>
+      </w:pPr>
+      <w:r>
+        <w:rPr>
+          <w:rFonts w:ascii="Palatino" w:hAnsi="Palatino"/>
+          <w:b w:val="1"/>
+          <w:bCs w:val="1"/>
+          <w:outline w:val="0"/>
+          <w:color w:val="485970"/>
+          <w:sz w:val="21"/>
+          <w:szCs w:val="21"/>
+          <w:u w:color="485970"/>
+          <w:rtl w:val="0"/>
+          <w:lang w:val="en-US"/>
+          <w14:textFill>
+            <w14:solidFill>
+              <w14:srgbClr w14:val="485970"/>
+            </w14:solidFill>
+          </w14:textFill>
+        </w:rPr>
+        <w:t xml:space="preserve">Revelthat</w:t>
+      </w:r>
+      <w:r>
+        <w:rPr>
+          <w:rFonts w:ascii="Palatino" w:hAnsi="Palatino"/>
+          <w:outline w:val="0"/>
+          <w:color w:val="485970"/>
+          <w:sz w:val="21"/>
+          <w:szCs w:val="21"/>
+          <w:u w:color="485970"/>
+          <w:rtl w:val="0"/>
+          <w:lang w:val="en-US"/>
+          <w14:textFill>
+            <w14:solidFill>
+              <w14:srgbClr w14:val="485970"/>
+            </w14:solidFill>
+          </w14:textFill>
+        </w:rPr>
+        <w:t xml:space="preserve">, Melbourne, Australia </w:t>
+      </w:r>
+      <w:r>
+        <w:rPr>
+          <w:rFonts w:ascii="Palatino" w:hAnsi="Palatino" w:hint="default"/>
+          <w:outline w:val="0"/>
+          <w:color w:val="485970"/>
+          <w:sz w:val="21"/>
+          <w:szCs w:val="21"/>
+          <w:u w:color="485970"/>
+          <w:rtl w:val="0"/>
+          <w:lang w:val="en-US"/>
+          <w14:textFill>
+            <w14:solidFill>
+              <w14:srgbClr w14:val="485970"/>
+            </w14:solidFill>
+          </w14:textFill>
+        </w:rPr>
+        <w:t xml:space="preserve">• </w:t>
+      </w:r>
+      <w:r>
+        <w:rPr>
+          <w:rFonts w:ascii="Palatino" w:hAnsi="Palatino"/>
+          <w:outline w:val="0"/>
+          <w:color w:val="485970"/>
+          <w:sz w:val="21"/>
+          <w:szCs w:val="21"/>
+          <w:u w:color="485970"/>
+          <w:rtl w:val="0"/>
+          <w:lang w:val="en-US"/>
+          <w14:textFill>
+            <w14:solidFill>
+              <w14:srgbClr w14:val="485970"/>
+            </w14:solidFill>
+          </w14:textFill>
+        </w:rPr>
+        <w:t xml:space="preserve">Adviser</w:t>
+      </w:r>
+      <w:r>
+        <w:rPr>
+          <w:rFonts w:ascii="Palatino" w:cs="Palatino" w:hAnsi="Palatino" w:eastAsia="Palatino"/>
+          <w:outline w:val="0"/>
+          <w:color w:val="485970"/>
+          <w:sz w:val="21"/>
+          <w:szCs w:val="21"/>
+          <w:u w:color="485970"/>
+          <w:rtl w:val="0"/>
+          <w:lang w:val="de-DE"/>
+          <w14:textFill>
+            <w14:solidFill>
+              <w14:srgbClr w14:val="485970"/>
+            </w14:solidFill>
+          </w14:textFill>
+        </w:rPr>
+        <w:tab/>
+        <w:t xml:space="preserve">2017-03-01 - 2018-07-01</w:t>
+      </w:r>
+    </w:p>
+    <w:p>
+      <w:pPr>
+        <w:pStyle w:val="Body A"/>
+        <w:tabs>
+          <w:tab w:val="right" w:pos="9360"/>
+        </w:tabs>
+        <w:spacing w:line="240" w:lineRule="auto"/>
+        <w:jc w:val="both"/>
+        <w:rPr>
+          <w:rFonts w:ascii="Calibri Light" w:cs="Calibri Light" w:hAnsi="Calibri Light" w:eastAsia="Calibri Light"/>
+          <w:outline w:val="0"/>
+          <w:color w:val="262626"/>
+          <w:sz w:val="20"/>
+          <w:szCs w:val="20"/>
+          <w:u w:color="262626"/>
+          <w14:textFill>
+            <w14:solidFill>
+              <w14:srgbClr w14:val="262626"/>
+            </w14:solidFill>
+          </w14:textFill>
+        </w:rPr>
+      </w:pPr>
+      <w:r>
+        <w:rPr>
+          <w:rFonts w:ascii="Calibri Light" w:hAnsi="Calibri Light"/>
+          <w:outline w:val="0"/>
+          <w:color w:val="262626"/>
+          <w:sz w:val="20"/>
+          <w:szCs w:val="20"/>
+          <w:u w:color="262626"/>
+          <w:rtl w:val="0"/>
+          <w:lang w:val="en-US"/>
+          <w14:textFill>
+            <w14:solidFill>
+              <w14:srgbClr w14:val="262626"/>
+            </w14:solidFill>
+          </w14:textFill>
+        </w:rPr>
+        <w:t/>
       </w:r>
     </w:p>
     <w:p>
@@ -3226,7 +3763,7 @@
             </w14:solidFill>
           </w14:textFill>
         </w:rPr>
-        <w:t xml:space="preserve">Built &amp; Nurtured a positive &amp; much lauded working culture</w:t>
+        <w:t xml:space="preserve">Provided guidance on product strategy, ownership, and best practices</w:t>
       </w:r>
     </w:p>
     <w:p>
@@ -3271,186 +3808,7 @@
             </w14:solidFill>
           </w14:textFill>
         </w:rPr>
-        <w:t xml:space="preserve">Implemented/maintained best practice Continuous Integration/Continuous Delivery/Test Automation &amp; Deployment pipelines</w:t>
-      </w:r>
-    </w:p>
-    <w:p>
-      <w:pPr>
-        <w:pStyle w:val="Body A"/>
-        <w:tabs>
-          <w:tab w:val="right" w:pos="9360"/>
-        </w:tabs>
-        <w:spacing w:after="0"/>
-        <w:jc w:val="both"/>
-        <w:rPr>
-          <w:rFonts w:ascii="Calibri Light" w:cs="Calibri Light" w:hAnsi="Calibri Light" w:eastAsia="Calibri Light"/>
-          <w:outline w:val="0"/>
-          <w:color w:val="262626"/>
-          <w:sz w:val="20"/>
-          <w:szCs w:val="20"/>
-          <w:u w:color="262626"/>
-          <w14:textFill>
-            <w14:solidFill>
-              <w14:srgbClr w14:val="262626"/>
-            </w14:solidFill>
-          </w14:textFill>
-        </w:rPr>
-      </w:pPr>
-    </w:p>
-    <w:p>
-      <w:pPr>
-        <w:pStyle w:val="Body A"/>
-        <w:tabs>
-          <w:tab w:val="right" w:pos="9916"/>
-        </w:tabs>
-        <w:spacing w:line="252" w:lineRule="auto"/>
-        <w:rPr>
-          <w:rFonts w:ascii="Palatino" w:cs="Palatino" w:hAnsi="Palatino" w:eastAsia="Palatino"/>
-          <w:outline w:val="0"/>
-          <w:color w:val="485970"/>
-          <w:sz w:val="21"/>
-          <w:szCs w:val="21"/>
-          <w:u w:color="485970"/>
-          <w14:textFill>
-            <w14:solidFill>
-              <w14:srgbClr w14:val="485970"/>
-            </w14:solidFill>
-          </w14:textFill>
-        </w:rPr>
-      </w:pPr>
-      <w:r>
-        <w:rPr>
-          <w:rFonts w:ascii="Palatino" w:hAnsi="Palatino"/>
-          <w:b w:val="1"/>
-          <w:bCs w:val="1"/>
-          <w:outline w:val="0"/>
-          <w:color w:val="485970"/>
-          <w:sz w:val="21"/>
-          <w:szCs w:val="21"/>
-          <w:u w:color="485970"/>
-          <w:rtl w:val="0"/>
-          <w:lang w:val="en-US"/>
-          <w14:textFill>
-            <w14:solidFill>
-              <w14:srgbClr w14:val="485970"/>
-            </w14:solidFill>
-          </w14:textFill>
-        </w:rPr>
-        <w:t xml:space="preserve">Revelthat</w:t>
-      </w:r>
-      <w:r>
-        <w:rPr>
-          <w:rFonts w:ascii="Palatino" w:hAnsi="Palatino"/>
-          <w:outline w:val="0"/>
-          <w:color w:val="485970"/>
-          <w:sz w:val="21"/>
-          <w:szCs w:val="21"/>
-          <w:u w:color="485970"/>
-          <w:rtl w:val="0"/>
-          <w:lang w:val="en-US"/>
-          <w14:textFill>
-            <w14:solidFill>
-              <w14:srgbClr w14:val="485970"/>
-            </w14:solidFill>
-          </w14:textFill>
-        </w:rPr>
-        <w:t xml:space="preserve">, Melbourne, Australia </w:t>
-      </w:r>
-      <w:r>
-        <w:rPr>
-          <w:rFonts w:ascii="Palatino" w:hAnsi="Palatino" w:hint="default"/>
-          <w:outline w:val="0"/>
-          <w:color w:val="485970"/>
-          <w:sz w:val="21"/>
-          <w:szCs w:val="21"/>
-          <w:u w:color="485970"/>
-          <w:rtl w:val="0"/>
-          <w:lang w:val="en-US"/>
-          <w14:textFill>
-            <w14:solidFill>
-              <w14:srgbClr w14:val="485970"/>
-            </w14:solidFill>
-          </w14:textFill>
-        </w:rPr>
-        <w:t xml:space="preserve">• </w:t>
-      </w:r>
-      <w:r>
-        <w:rPr>
-          <w:rFonts w:ascii="Palatino" w:hAnsi="Palatino"/>
-          <w:outline w:val="0"/>
-          <w:color w:val="485970"/>
-          <w:sz w:val="21"/>
-          <w:szCs w:val="21"/>
-          <w:u w:color="485970"/>
-          <w:rtl w:val="0"/>
-          <w:lang w:val="en-US"/>
-          <w14:textFill>
-            <w14:solidFill>
-              <w14:srgbClr w14:val="485970"/>
-            </w14:solidFill>
-          </w14:textFill>
-        </w:rPr>
-        <w:t xml:space="preserve">Adviser</w:t>
-      </w:r>
-      <w:r>
-        <w:rPr>
-          <w:rFonts w:ascii="Palatino" w:cs="Palatino" w:hAnsi="Palatino" w:eastAsia="Palatino"/>
-          <w:outline w:val="0"/>
-          <w:color w:val="485970"/>
-          <w:sz w:val="21"/>
-          <w:szCs w:val="21"/>
-          <w:u w:color="485970"/>
-          <w:rtl w:val="0"/>
-          <w:lang w:val="de-DE"/>
-          <w14:textFill>
-            <w14:solidFill>
-              <w14:srgbClr w14:val="485970"/>
-            </w14:solidFill>
-          </w14:textFill>
-        </w:rPr>
-        <w:tab/>
-        <w:t xml:space="preserve">2017-03-01 - 2018-07-01</w:t>
-      </w:r>
-    </w:p>
-    <w:p>
-      <w:pPr>
-        <w:pStyle w:val="Body A"/>
-        <w:tabs>
-          <w:tab w:val="right" w:pos="9360"/>
-        </w:tabs>
-        <w:spacing w:line="240" w:lineRule="auto"/>
-        <w:jc w:val="both"/>
-        <w:rPr>
-          <w:rFonts w:ascii="Calibri Light" w:cs="Calibri Light" w:hAnsi="Calibri Light" w:eastAsia="Calibri Light"/>
-          <w:outline w:val="0"/>
-          <w:color w:val="262626"/>
-          <w:sz w:val="20"/>
-          <w:szCs w:val="20"/>
-          <w:u w:color="262626"/>
-          <w14:textFill>
-            <w14:solidFill>
-              <w14:srgbClr w14:val="262626"/>
-            </w14:solidFill>
-          </w14:textFill>
-        </w:rPr>
-      </w:pPr>
-      <w:r>
-        <w:rPr>
-          <w:rFonts w:ascii="Calibri Light" w:hAnsi="Calibri Light"/>
-          <w:outline w:val="0"/>
-          <w:color w:val="262626"/>
-          <w:sz w:val="20"/>
-          <w:szCs w:val="20"/>
-          <w:u w:color="262626"/>
-          <w:rtl w:val="0"/>
-          <w:lang w:val="en-US"/>
-          <w14:textFill>
-            <w14:solidFill>
-              <w14:srgbClr w14:val="262626"/>
-            </w14:solidFill>
-          </w14:textFill>
-        </w:rPr>
-        <w:t/>
+        <w:t xml:space="preserve">Made key individual contributions (IC) with a focus on Django/Python</w:t>
       </w:r>
     </w:p>
     <w:p>
@@ -3495,7 +3853,7 @@
             </w14:solidFill>
           </w14:textFill>
         </w:rPr>
-        <w:t xml:space="preserve">Provided guidance on product strategy, ownership, and best practices</w:t>
+        <w:t xml:space="preserve">Implemented and optimised development (CI/CD) pipelines for increased efficiency</w:t>
       </w:r>
     </w:p>
     <w:p>
@@ -3540,7 +3898,186 @@
             </w14:solidFill>
           </w14:textFill>
         </w:rPr>
-        <w:t xml:space="preserve">Made key individual contributions (IC) with a focus on Django/Python</w:t>
+        <w:t xml:space="preserve">Advised on and assisted with the hiring and recruiting process</w:t>
+      </w:r>
+    </w:p>
+    <w:p>
+      <w:pPr>
+        <w:pStyle w:val="Body A"/>
+        <w:tabs>
+          <w:tab w:val="right" w:pos="9360"/>
+        </w:tabs>
+        <w:spacing w:after="0"/>
+        <w:jc w:val="both"/>
+        <w:rPr>
+          <w:rFonts w:ascii="Calibri Light" w:cs="Calibri Light" w:hAnsi="Calibri Light" w:eastAsia="Calibri Light"/>
+          <w:outline w:val="0"/>
+          <w:color w:val="262626"/>
+          <w:sz w:val="20"/>
+          <w:szCs w:val="20"/>
+          <w:u w:color="262626"/>
+          <w14:textFill>
+            <w14:solidFill>
+              <w14:srgbClr w14:val="262626"/>
+            </w14:solidFill>
+          </w14:textFill>
+        </w:rPr>
+      </w:pPr>
+    </w:p>
+    <w:p>
+      <w:pPr>
+        <w:pStyle w:val="Body A"/>
+        <w:tabs>
+          <w:tab w:val="right" w:pos="9916"/>
+        </w:tabs>
+        <w:spacing w:line="252" w:lineRule="auto"/>
+        <w:rPr>
+          <w:rFonts w:ascii="Palatino" w:cs="Palatino" w:hAnsi="Palatino" w:eastAsia="Palatino"/>
+          <w:outline w:val="0"/>
+          <w:color w:val="485970"/>
+          <w:sz w:val="21"/>
+          <w:szCs w:val="21"/>
+          <w:u w:color="485970"/>
+          <w14:textFill>
+            <w14:solidFill>
+              <w14:srgbClr w14:val="485970"/>
+            </w14:solidFill>
+          </w14:textFill>
+        </w:rPr>
+      </w:pPr>
+      <w:r>
+        <w:rPr>
+          <w:rFonts w:ascii="Palatino" w:hAnsi="Palatino"/>
+          <w:b w:val="1"/>
+          <w:bCs w:val="1"/>
+          <w:outline w:val="0"/>
+          <w:color w:val="485970"/>
+          <w:sz w:val="21"/>
+          <w:szCs w:val="21"/>
+          <w:u w:color="485970"/>
+          <w:rtl w:val="0"/>
+          <w:lang w:val="en-US"/>
+          <w14:textFill>
+            <w14:solidFill>
+              <w14:srgbClr w14:val="485970"/>
+            </w14:solidFill>
+          </w14:textFill>
+        </w:rPr>
+        <w:t xml:space="preserve">Alliance Software</w:t>
+      </w:r>
+      <w:r>
+        <w:rPr>
+          <w:rFonts w:ascii="Palatino" w:hAnsi="Palatino"/>
+          <w:outline w:val="0"/>
+          <w:color w:val="485970"/>
+          <w:sz w:val="21"/>
+          <w:szCs w:val="21"/>
+          <w:u w:color="485970"/>
+          <w:rtl w:val="0"/>
+          <w:lang w:val="en-US"/>
+          <w14:textFill>
+            <w14:solidFill>
+              <w14:srgbClr w14:val="485970"/>
+            </w14:solidFill>
+          </w14:textFill>
+        </w:rPr>
+        <w:t xml:space="preserve">, Melbourne, Australia </w:t>
+      </w:r>
+      <w:r>
+        <w:rPr>
+          <w:rFonts w:ascii="Palatino" w:hAnsi="Palatino" w:hint="default"/>
+          <w:outline w:val="0"/>
+          <w:color w:val="485970"/>
+          <w:sz w:val="21"/>
+          <w:szCs w:val="21"/>
+          <w:u w:color="485970"/>
+          <w:rtl w:val="0"/>
+          <w:lang w:val="en-US"/>
+          <w14:textFill>
+            <w14:solidFill>
+              <w14:srgbClr w14:val="485970"/>
+            </w14:solidFill>
+          </w14:textFill>
+        </w:rPr>
+        <w:t xml:space="preserve">• </w:t>
+      </w:r>
+      <w:r>
+        <w:rPr>
+          <w:rFonts w:ascii="Palatino" w:hAnsi="Palatino"/>
+          <w:outline w:val="0"/>
+          <w:color w:val="485970"/>
+          <w:sz w:val="21"/>
+          <w:szCs w:val="21"/>
+          <w:u w:color="485970"/>
+          <w:rtl w:val="0"/>
+          <w:lang w:val="en-US"/>
+          <w14:textFill>
+            <w14:solidFill>
+              <w14:srgbClr w14:val="485970"/>
+            </w14:solidFill>
+          </w14:textFill>
+        </w:rPr>
+        <w:t xml:space="preserve">Lead Senior Engineer</w:t>
+      </w:r>
+      <w:r>
+        <w:rPr>
+          <w:rFonts w:ascii="Palatino" w:cs="Palatino" w:hAnsi="Palatino" w:eastAsia="Palatino"/>
+          <w:outline w:val="0"/>
+          <w:color w:val="485970"/>
+          <w:sz w:val="21"/>
+          <w:szCs w:val="21"/>
+          <w:u w:color="485970"/>
+          <w:rtl w:val="0"/>
+          <w:lang w:val="de-DE"/>
+          <w14:textFill>
+            <w14:solidFill>
+              <w14:srgbClr w14:val="485970"/>
+            </w14:solidFill>
+          </w14:textFill>
+        </w:rPr>
+        <w:tab/>
+        <w:t xml:space="preserve">2006-03-01 - 2012-05-01</w:t>
+      </w:r>
+    </w:p>
+    <w:p>
+      <w:pPr>
+        <w:pStyle w:val="Body A"/>
+        <w:tabs>
+          <w:tab w:val="right" w:pos="9360"/>
+        </w:tabs>
+        <w:spacing w:line="240" w:lineRule="auto"/>
+        <w:jc w:val="both"/>
+        <w:rPr>
+          <w:rFonts w:ascii="Calibri Light" w:cs="Calibri Light" w:hAnsi="Calibri Light" w:eastAsia="Calibri Light"/>
+          <w:outline w:val="0"/>
+          <w:color w:val="262626"/>
+          <w:sz w:val="20"/>
+          <w:szCs w:val="20"/>
+          <w:u w:color="262626"/>
+          <w14:textFill>
+            <w14:solidFill>
+              <w14:srgbClr w14:val="262626"/>
+            </w14:solidFill>
+          </w14:textFill>
+        </w:rPr>
+      </w:pPr>
+      <w:r>
+        <w:rPr>
+          <w:rFonts w:ascii="Calibri Light" w:hAnsi="Calibri Light"/>
+          <w:outline w:val="0"/>
+          <w:color w:val="262626"/>
+          <w:sz w:val="20"/>
+          <w:szCs w:val="20"/>
+          <w:u w:color="262626"/>
+          <w:rtl w:val="0"/>
+          <w:lang w:val="en-US"/>
+          <w14:textFill>
+            <w14:solidFill>
+              <w14:srgbClr w14:val="262626"/>
+            </w14:solidFill>
+          </w14:textFill>
+        </w:rPr>
+        <w:t/>
       </w:r>
     </w:p>
     <w:p>
@@ -3585,7 +4122,7 @@
             </w14:solidFill>
           </w14:textFill>
         </w:rPr>
-        <w:t xml:space="preserve">Implemented and optimised development (CI/CD) pipelines for increased efficiency</w:t>
+        <w:t xml:space="preserve">Lead, hired and mentored other software engineers</w:t>
       </w:r>
     </w:p>
     <w:p>
@@ -3630,186 +4167,7 @@
             </w14:solidFill>
           </w14:textFill>
         </w:rPr>
-        <w:t xml:space="preserve">Advised on and assisted with the hiring and recruiting process</w:t>
-      </w:r>
-    </w:p>
-    <w:p>
-      <w:pPr>
-        <w:pStyle w:val="Body A"/>
-        <w:tabs>
-          <w:tab w:val="right" w:pos="9360"/>
-        </w:tabs>
-        <w:spacing w:after="0"/>
-        <w:jc w:val="both"/>
-        <w:rPr>
-          <w:rFonts w:ascii="Calibri Light" w:cs="Calibri Light" w:hAnsi="Calibri Light" w:eastAsia="Calibri Light"/>
-          <w:outline w:val="0"/>
-          <w:color w:val="262626"/>
-          <w:sz w:val="20"/>
-          <w:szCs w:val="20"/>
-          <w:u w:color="262626"/>
-          <w14:textFill>
-            <w14:solidFill>
-              <w14:srgbClr w14:val="262626"/>
-            </w14:solidFill>
-          </w14:textFill>
-        </w:rPr>
-      </w:pPr>
-    </w:p>
-    <w:p>
-      <w:pPr>
-        <w:pStyle w:val="Body A"/>
-        <w:tabs>
-          <w:tab w:val="right" w:pos="9916"/>
-        </w:tabs>
-        <w:spacing w:line="252" w:lineRule="auto"/>
-        <w:rPr>
-          <w:rFonts w:ascii="Palatino" w:cs="Palatino" w:hAnsi="Palatino" w:eastAsia="Palatino"/>
-          <w:outline w:val="0"/>
-          <w:color w:val="485970"/>
-          <w:sz w:val="21"/>
-          <w:szCs w:val="21"/>
-          <w:u w:color="485970"/>
-          <w14:textFill>
-            <w14:solidFill>
-              <w14:srgbClr w14:val="485970"/>
-            </w14:solidFill>
-          </w14:textFill>
-        </w:rPr>
-      </w:pPr>
-      <w:r>
-        <w:rPr>
-          <w:rFonts w:ascii="Palatino" w:hAnsi="Palatino"/>
-          <w:b w:val="1"/>
-          <w:bCs w:val="1"/>
-          <w:outline w:val="0"/>
-          <w:color w:val="485970"/>
-          <w:sz w:val="21"/>
-          <w:szCs w:val="21"/>
-          <w:u w:color="485970"/>
-          <w:rtl w:val="0"/>
-          <w:lang w:val="en-US"/>
-          <w14:textFill>
-            <w14:solidFill>
-              <w14:srgbClr w14:val="485970"/>
-            </w14:solidFill>
-          </w14:textFill>
-        </w:rPr>
-        <w:t xml:space="preserve">Alliance Software</w:t>
-      </w:r>
-      <w:r>
-        <w:rPr>
-          <w:rFonts w:ascii="Palatino" w:hAnsi="Palatino"/>
-          <w:outline w:val="0"/>
-          <w:color w:val="485970"/>
-          <w:sz w:val="21"/>
-          <w:szCs w:val="21"/>
-          <w:u w:color="485970"/>
-          <w:rtl w:val="0"/>
-          <w:lang w:val="en-US"/>
-          <w14:textFill>
-            <w14:solidFill>
-              <w14:srgbClr w14:val="485970"/>
-            </w14:solidFill>
-          </w14:textFill>
-        </w:rPr>
-        <w:t xml:space="preserve">, Melbourne, Australia </w:t>
-      </w:r>
-      <w:r>
-        <w:rPr>
-          <w:rFonts w:ascii="Palatino" w:hAnsi="Palatino" w:hint="default"/>
-          <w:outline w:val="0"/>
-          <w:color w:val="485970"/>
-          <w:sz w:val="21"/>
-          <w:szCs w:val="21"/>
-          <w:u w:color="485970"/>
-          <w:rtl w:val="0"/>
-          <w:lang w:val="en-US"/>
-          <w14:textFill>
-            <w14:solidFill>
-              <w14:srgbClr w14:val="485970"/>
-            </w14:solidFill>
-          </w14:textFill>
-        </w:rPr>
-        <w:t xml:space="preserve">• </w:t>
-      </w:r>
-      <w:r>
-        <w:rPr>
-          <w:rFonts w:ascii="Palatino" w:hAnsi="Palatino"/>
-          <w:outline w:val="0"/>
-          <w:color w:val="485970"/>
-          <w:sz w:val="21"/>
-          <w:szCs w:val="21"/>
-          <w:u w:color="485970"/>
-          <w:rtl w:val="0"/>
-          <w:lang w:val="en-US"/>
-          <w14:textFill>
-            <w14:solidFill>
-              <w14:srgbClr w14:val="485970"/>
-            </w14:solidFill>
-          </w14:textFill>
-        </w:rPr>
-        <w:t xml:space="preserve">Lead Senior Engineer</w:t>
-      </w:r>
-      <w:r>
-        <w:rPr>
-          <w:rFonts w:ascii="Palatino" w:cs="Palatino" w:hAnsi="Palatino" w:eastAsia="Palatino"/>
-          <w:outline w:val="0"/>
-          <w:color w:val="485970"/>
-          <w:sz w:val="21"/>
-          <w:szCs w:val="21"/>
-          <w:u w:color="485970"/>
-          <w:rtl w:val="0"/>
-          <w:lang w:val="de-DE"/>
-          <w14:textFill>
-            <w14:solidFill>
-              <w14:srgbClr w14:val="485970"/>
-            </w14:solidFill>
-          </w14:textFill>
-        </w:rPr>
-        <w:tab/>
-        <w:t xml:space="preserve">2006-03-01 - 2012-05-01</w:t>
-      </w:r>
-    </w:p>
-    <w:p>
-      <w:pPr>
-        <w:pStyle w:val="Body A"/>
-        <w:tabs>
-          <w:tab w:val="right" w:pos="9360"/>
-        </w:tabs>
-        <w:spacing w:line="240" w:lineRule="auto"/>
-        <w:jc w:val="both"/>
-        <w:rPr>
-          <w:rFonts w:ascii="Calibri Light" w:cs="Calibri Light" w:hAnsi="Calibri Light" w:eastAsia="Calibri Light"/>
-          <w:outline w:val="0"/>
-          <w:color w:val="262626"/>
-          <w:sz w:val="20"/>
-          <w:szCs w:val="20"/>
-          <w:u w:color="262626"/>
-          <w14:textFill>
-            <w14:solidFill>
-              <w14:srgbClr w14:val="262626"/>
-            </w14:solidFill>
-          </w14:textFill>
-        </w:rPr>
-      </w:pPr>
-      <w:r>
-        <w:rPr>
-          <w:rFonts w:ascii="Calibri Light" w:hAnsi="Calibri Light"/>
-          <w:outline w:val="0"/>
-          <w:color w:val="262626"/>
-          <w:sz w:val="20"/>
-          <w:szCs w:val="20"/>
-          <w:u w:color="262626"/>
-          <w:rtl w:val="0"/>
-          <w:lang w:val="en-US"/>
-          <w14:textFill>
-            <w14:solidFill>
-              <w14:srgbClr w14:val="262626"/>
-            </w14:solidFill>
-          </w14:textFill>
-        </w:rPr>
-        <w:t/>
+        <w:t xml:space="preserve">Collaborated &amp; mentored Senior Developers, Juniors &amp; Contractors and provided technical advice and direction to management</w:t>
       </w:r>
     </w:p>
     <w:p>
@@ -3854,7 +4212,7 @@
             </w14:solidFill>
           </w14:textFill>
         </w:rPr>
-        <w:t xml:space="preserve">Lead, hired and mentored other software engineers</w:t>
+        <w:t xml:space="preserve">Delivered E2E &amp; supported over 20 projects with Ruby on Rails/Zend Framework</w:t>
       </w:r>
     </w:p>
     <w:p>
@@ -3899,7 +4257,7 @@
             </w14:solidFill>
           </w14:textFill>
         </w:rPr>
-        <w:t xml:space="preserve">Collaborated &amp; mentored Senior Developers, Juniors &amp; Contractors and provided technical advice and direction to management</w:t>
+        <w:t xml:space="preserve">Built a custom Zend Framework based Video Delivery platform that was pitched as a corporate Video Delivery Platform &amp; CMS, this integrated with third party video platforms such as Brightcove and BitsOnTheRun. Features such as channel creation, pre/post roll advertisement injection, video scheduling and search by time based video meta data, it was later sold to a USA based company</w:t>
       </w:r>
     </w:p>
     <w:p>
@@ -3944,7 +4302,7 @@
             </w14:solidFill>
           </w14:textFill>
         </w:rPr>
-        <w:t xml:space="preserve">Delivered E2E &amp; supported over 20 projects with Ruby on Rails/Zend Framework</w:t>
+        <w:t xml:space="preserve">Phased out a legacy custom built PHP CMS and coordinated / co-developed a complete rewrite of the CMS using Zend Framework which is now in use in a multitude of sites</w:t>
       </w:r>
     </w:p>
     <w:p>
@@ -3989,7 +4347,186 @@
             </w14:solidFill>
           </w14:textFill>
         </w:rPr>
-        <w:t xml:space="preserve">Built a custom Zend Framework based Video Delivery platform that was pitched as a corporate Video Delivery Platform &amp; CMS, this integrated with third party video platforms such as Brightcove and BitsOnTheRun. Features such as channel creation, pre/post roll advertisement injection, video scheduling and search by time based video meta data, it was later sold to a USA based company</w:t>
+        <w:t xml:space="preserve">Supported and maintained a high traffic legacy CMS based site for a popular travel company. Routinely dealt directly with the client and collaborated with their hosting company, their IT department and key stake holders to achieve great project outcomes. Implemented solutions for integration with an internal File Maker Database, Online Trip Payments &amp; Online Trip Bookings* Lead, hired and mentored other software engineers * Collaborated &amp; mentored Senior Developers, Juniors &amp; Contractors and provided technical advice and direction to management * Delivered E2E &amp; supported over 20 projects with Rails/Zend Framework * Built a custom Zend Framework based Video Delivery platform that was pitched as a corporate Video Delivery Platform &amp; CMS, this integrated with third party video platforms such as Brightcove and BitsOnTheRun. Features such as channel creation, pre/post roll advertisement injection, video scheduling and search by time based video meta data, it was later sold to a USA based company. * Phased out a legacy custom built PHP CMS and coordinated / co-developed a complete rewrite of the CMS using Zend Framework which is now in use in a multitude of sites. * Supported and maintained a high traffic legacy CMS based site for a popular travel company. Routinely dealt directly with the client and collaborated with their hosting company, their IT department and key stake holders to achieve great project outcomes. Implemented solutions for integration with an internal File Maker Database, Online Trip Payments &amp; Online Trip Bookings</w:t>
+      </w:r>
+    </w:p>
+    <w:p>
+      <w:pPr>
+        <w:pStyle w:val="Body A"/>
+        <w:tabs>
+          <w:tab w:val="right" w:pos="9360"/>
+        </w:tabs>
+        <w:spacing w:after="0"/>
+        <w:jc w:val="both"/>
+        <w:rPr>
+          <w:rFonts w:ascii="Calibri Light" w:cs="Calibri Light" w:hAnsi="Calibri Light" w:eastAsia="Calibri Light"/>
+          <w:outline w:val="0"/>
+          <w:color w:val="262626"/>
+          <w:sz w:val="20"/>
+          <w:szCs w:val="20"/>
+          <w:u w:color="262626"/>
+          <w14:textFill>
+            <w14:solidFill>
+              <w14:srgbClr w14:val="262626"/>
+            </w14:solidFill>
+          </w14:textFill>
+        </w:rPr>
+      </w:pPr>
+    </w:p>
+    <w:p>
+      <w:pPr>
+        <w:pStyle w:val="Body A"/>
+        <w:tabs>
+          <w:tab w:val="right" w:pos="9916"/>
+        </w:tabs>
+        <w:spacing w:line="252" w:lineRule="auto"/>
+        <w:rPr>
+          <w:rFonts w:ascii="Palatino" w:cs="Palatino" w:hAnsi="Palatino" w:eastAsia="Palatino"/>
+          <w:outline w:val="0"/>
+          <w:color w:val="485970"/>
+          <w:sz w:val="21"/>
+          <w:szCs w:val="21"/>
+          <w:u w:color="485970"/>
+          <w14:textFill>
+            <w14:solidFill>
+              <w14:srgbClr w14:val="485970"/>
+            </w14:solidFill>
+          </w14:textFill>
+        </w:rPr>
+      </w:pPr>
+      <w:r>
+        <w:rPr>
+          <w:rFonts w:ascii="Palatino" w:hAnsi="Palatino"/>
+          <w:b w:val="1"/>
+          <w:bCs w:val="1"/>
+          <w:outline w:val="0"/>
+          <w:color w:val="485970"/>
+          <w:sz w:val="21"/>
+          <w:szCs w:val="21"/>
+          <w:u w:color="485970"/>
+          <w:rtl w:val="0"/>
+          <w:lang w:val="en-US"/>
+          <w14:textFill>
+            <w14:solidFill>
+              <w14:srgbClr w14:val="485970"/>
+            </w14:solidFill>
+          </w14:textFill>
+        </w:rPr>
+        <w:t xml:space="preserve">Boche Collection</w:t>
+      </w:r>
+      <w:r>
+        <w:rPr>
+          <w:rFonts w:ascii="Palatino" w:hAnsi="Palatino"/>
+          <w:outline w:val="0"/>
+          <w:color w:val="485970"/>
+          <w:sz w:val="21"/>
+          <w:szCs w:val="21"/>
+          <w:u w:color="485970"/>
+          <w:rtl w:val="0"/>
+          <w:lang w:val="en-US"/>
+          <w14:textFill>
+            <w14:solidFill>
+              <w14:srgbClr w14:val="485970"/>
+            </w14:solidFill>
+          </w14:textFill>
+        </w:rPr>
+        <w:t xml:space="preserve">, Melbourne, Australia </w:t>
+      </w:r>
+      <w:r>
+        <w:rPr>
+          <w:rFonts w:ascii="Palatino" w:hAnsi="Palatino" w:hint="default"/>
+          <w:outline w:val="0"/>
+          <w:color w:val="485970"/>
+          <w:sz w:val="21"/>
+          <w:szCs w:val="21"/>
+          <w:u w:color="485970"/>
+          <w:rtl w:val="0"/>
+          <w:lang w:val="en-US"/>
+          <w14:textFill>
+            <w14:solidFill>
+              <w14:srgbClr w14:val="485970"/>
+            </w14:solidFill>
+          </w14:textFill>
+        </w:rPr>
+        <w:t xml:space="preserve">• </w:t>
+      </w:r>
+      <w:r>
+        <w:rPr>
+          <w:rFonts w:ascii="Palatino" w:hAnsi="Palatino"/>
+          <w:outline w:val="0"/>
+          <w:color w:val="485970"/>
+          <w:sz w:val="21"/>
+          <w:szCs w:val="21"/>
+          <w:u w:color="485970"/>
+          <w:rtl w:val="0"/>
+          <w:lang w:val="en-US"/>
+          <w14:textFill>
+            <w14:solidFill>
+              <w14:srgbClr w14:val="485970"/>
+            </w14:solidFill>
+          </w14:textFill>
+        </w:rPr>
+        <w:t xml:space="preserve">Co-Owner</w:t>
+      </w:r>
+      <w:r>
+        <w:rPr>
+          <w:rFonts w:ascii="Palatino" w:cs="Palatino" w:hAnsi="Palatino" w:eastAsia="Palatino"/>
+          <w:outline w:val="0"/>
+          <w:color w:val="485970"/>
+          <w:sz w:val="21"/>
+          <w:szCs w:val="21"/>
+          <w:u w:color="485970"/>
+          <w:rtl w:val="0"/>
+          <w:lang w:val="de-DE"/>
+          <w14:textFill>
+            <w14:solidFill>
+              <w14:srgbClr w14:val="485970"/>
+            </w14:solidFill>
+          </w14:textFill>
+        </w:rPr>
+        <w:tab/>
+        <w:t xml:space="preserve">2006-03-01 - 2012-05-01</w:t>
+      </w:r>
+    </w:p>
+    <w:p>
+      <w:pPr>
+        <w:pStyle w:val="Body A"/>
+        <w:tabs>
+          <w:tab w:val="right" w:pos="9360"/>
+        </w:tabs>
+        <w:spacing w:line="240" w:lineRule="auto"/>
+        <w:jc w:val="both"/>
+        <w:rPr>
+          <w:rFonts w:ascii="Calibri Light" w:cs="Calibri Light" w:hAnsi="Calibri Light" w:eastAsia="Calibri Light"/>
+          <w:outline w:val="0"/>
+          <w:color w:val="262626"/>
+          <w:sz w:val="20"/>
+          <w:szCs w:val="20"/>
+          <w:u w:color="262626"/>
+          <w14:textFill>
+            <w14:solidFill>
+              <w14:srgbClr w14:val="262626"/>
+            </w14:solidFill>
+          </w14:textFill>
+        </w:rPr>
+      </w:pPr>
+      <w:r>
+        <w:rPr>
+          <w:rFonts w:ascii="Calibri Light" w:hAnsi="Calibri Light"/>
+          <w:outline w:val="0"/>
+          <w:color w:val="262626"/>
+          <w:sz w:val="20"/>
+          <w:szCs w:val="20"/>
+          <w:u w:color="262626"/>
+          <w:rtl w:val="0"/>
+          <w:lang w:val="en-US"/>
+          <w14:textFill>
+            <w14:solidFill>
+              <w14:srgbClr w14:val="262626"/>
+            </w14:solidFill>
+          </w14:textFill>
+        </w:rPr>
+        <w:t/>
       </w:r>
     </w:p>
     <w:p>
@@ -4034,52 +4571,7 @@
             </w14:solidFill>
           </w14:textFill>
         </w:rPr>
-        <w:t xml:space="preserve">Phased out a legacy custom built PHP CMS and coordinated / co-developed a complete rewrite of the CMS using Zend Framework which is now in use in a multitude of sites</w:t>
-      </w:r>
-    </w:p>
-    <w:p>
-      <w:pPr>
-        <w:pStyle w:val="Body A"/>
-        <w:numPr>
-          <w:ilvl w:val="0"/>
-          <w:numId w:val="2"/>
-        </w:numPr>
-        <w:bidi w:val="0"/>
-        <w:spacing w:after="0" w:line="240" w:lineRule="auto"/>
-        <w:ind w:right="0"/>
-        <w:jc w:val="both"/>
-        <w:rPr>
-          <w:rFonts w:ascii="Calibri Light" w:hAnsi="Calibri Light"/>
-          <w:outline w:val="0"/>
-          <w:color w:val="262626"/>
-          <w:sz w:val="20"/>
-          <w:szCs w:val="20"/>
-          <w:rtl w:val="0"/>
-          <w:lang w:val="en-US"/>
-          <w14:textFill>
-            <w14:solidFill>
-              <w14:srgbClr w14:val="262626"/>
-            </w14:solidFill>
-          </w14:textFill>
-        </w:rPr>
-      </w:pPr>
-      <w:r>
-        <w:rPr>
-          <w:rFonts w:ascii="Calibri Light" w:hAnsi="Calibri Light"/>
-          <w:outline w:val="0"/>
-          <w:color w:val="262626"/>
-          <w:sz w:val="20"/>
-          <w:szCs w:val="20"/>
-          <w:u w:color="262626"/>
-          <w:rtl w:val="0"/>
-          <w:lang w:val="en-US"/>
-          <w14:textFill>
-            <w14:solidFill>
-              <w14:srgbClr w14:val="262626"/>
-            </w14:solidFill>
-          </w14:textFill>
-        </w:rPr>
-        <w:t xml:space="preserve">Supported and maintained a high traffic legacy CMS based site for a popular travel company. Routinely dealt directly with the client and collaborated with their hosting company, their IT department and key stake holders to achieve great project outcomes. Implemented solutions for integration with an internal File Maker Database, Online Trip Payments &amp; Online Trip Bookings* Lead, hired and mentored other software engineers * Collaborated &amp; mentored Senior Developers, Juniors &amp; Contractors and provided technical advice and direction to management * Delivered E2E &amp; supported over 20 projects with Rails/Zend Framework * Built a custom Zend Framework based Video Delivery platform that was pitched as a corporate Video Delivery Platform &amp; CMS, this integrated with third party video platforms such as Brightcove and BitsOnTheRun. Features such as channel creation, pre/post roll advertisement injection, video scheduling and search by time based video meta data, it was later sold to a USA based company. * Phased out a legacy custom built PHP CMS and coordinated / co-developed a complete rewrite of the CMS using Zend Framework which is now in use in a multitude of sites. * Supported and maintained a high traffic legacy CMS based site for a popular travel company. Routinely dealt directly with the client and collaborated with their hosting company, their IT department and key stake holders to achieve great project outcomes. Implemented solutions for integration with an internal File Maker Database, Online Trip Payments &amp; Online Trip Bookings</w:t>
+        <w:t xml:space="preserve">Created &amp; maintained a custom Ruby on Rails based online e-commerce platform for clothing retail, stock management, invoice management &amp; CRM</w:t>
       </w:r>
     </w:p>
     <w:p>
@@ -4144,7 +4636,7 @@
             </w14:solidFill>
           </w14:textFill>
         </w:rPr>
-        <w:t xml:space="preserve">Boche Collection</w:t>
+        <w:t xml:space="preserve">Revium</w:t>
       </w:r>
       <w:r>
         <w:rPr>
@@ -4198,231 +4690,7 @@
             </w14:solidFill>
           </w14:textFill>
         </w:rPr>
-        <w:t xml:space="preserve">Co-Owner</w:t>
-      </w:r>
-      <w:r>
-        <w:rPr>
-          <w:rFonts w:ascii="Palatino" w:cs="Palatino" w:hAnsi="Palatino" w:eastAsia="Palatino"/>
-          <w:outline w:val="0"/>
-          <w:color w:val="485970"/>
-          <w:sz w:val="21"/>
-          <w:szCs w:val="21"/>
-          <w:u w:color="485970"/>
-          <w:rtl w:val="0"/>
-          <w:lang w:val="de-DE"/>
-          <w14:textFill>
-            <w14:solidFill>
-              <w14:srgbClr w14:val="485970"/>
-            </w14:solidFill>
-          </w14:textFill>
-        </w:rPr>
-        <w:tab/>
-        <w:t xml:space="preserve">2006-03-01 - 2012-05-01</w:t>
-      </w:r>
-    </w:p>
-    <w:p>
-      <w:pPr>
-        <w:pStyle w:val="Body A"/>
-        <w:tabs>
-          <w:tab w:val="right" w:pos="9360"/>
-        </w:tabs>
-        <w:spacing w:line="240" w:lineRule="auto"/>
-        <w:jc w:val="both"/>
-        <w:rPr>
-          <w:rFonts w:ascii="Calibri Light" w:cs="Calibri Light" w:hAnsi="Calibri Light" w:eastAsia="Calibri Light"/>
-          <w:outline w:val="0"/>
-          <w:color w:val="262626"/>
-          <w:sz w:val="20"/>
-          <w:szCs w:val="20"/>
-          <w:u w:color="262626"/>
-          <w14:textFill>
-            <w14:solidFill>
-              <w14:srgbClr w14:val="262626"/>
-            </w14:solidFill>
-          </w14:textFill>
-        </w:rPr>
-      </w:pPr>
-      <w:r>
-        <w:rPr>
-          <w:rFonts w:ascii="Calibri Light" w:hAnsi="Calibri Light"/>
-          <w:outline w:val="0"/>
-          <w:color w:val="262626"/>
-          <w:sz w:val="20"/>
-          <w:szCs w:val="20"/>
-          <w:u w:color="262626"/>
-          <w:rtl w:val="0"/>
-          <w:lang w:val="en-US"/>
-          <w14:textFill>
-            <w14:solidFill>
-              <w14:srgbClr w14:val="262626"/>
-            </w14:solidFill>
-          </w14:textFill>
-        </w:rPr>
-        <w:t/>
-      </w:r>
-    </w:p>
-    <w:p>
-      <w:pPr>
-        <w:pStyle w:val="Body A"/>
-        <w:numPr>
-          <w:ilvl w:val="0"/>
-          <w:numId w:val="2"/>
-        </w:numPr>
-        <w:bidi w:val="0"/>
-        <w:spacing w:after="0" w:line="240" w:lineRule="auto"/>
-        <w:ind w:right="0"/>
-        <w:jc w:val="both"/>
-        <w:rPr>
-          <w:rFonts w:ascii="Calibri Light" w:hAnsi="Calibri Light"/>
-          <w:outline w:val="0"/>
-          <w:color w:val="262626"/>
-          <w:sz w:val="20"/>
-          <w:szCs w:val="20"/>
-          <w:rtl w:val="0"/>
-          <w:lang w:val="en-US"/>
-          <w14:textFill>
-            <w14:solidFill>
-              <w14:srgbClr w14:val="262626"/>
-            </w14:solidFill>
-          </w14:textFill>
-        </w:rPr>
-      </w:pPr>
-      <w:r>
-        <w:rPr>
-          <w:rFonts w:ascii="Calibri Light" w:hAnsi="Calibri Light"/>
-          <w:outline w:val="0"/>
-          <w:color w:val="262626"/>
-          <w:sz w:val="20"/>
-          <w:szCs w:val="20"/>
-          <w:u w:color="262626"/>
-          <w:rtl w:val="0"/>
-          <w:lang w:val="en-US"/>
-          <w14:textFill>
-            <w14:solidFill>
-              <w14:srgbClr w14:val="262626"/>
-            </w14:solidFill>
-          </w14:textFill>
-        </w:rPr>
-        <w:t xml:space="preserve">Created &amp; maintained a custom Ruby on Rails based online e-commerce platform for clothing retail, stock management, invoice management &amp; CRM</w:t>
-      </w:r>
-    </w:p>
-    <w:p>
-      <w:pPr>
-        <w:pStyle w:val="Body A"/>
-        <w:tabs>
-          <w:tab w:val="right" w:pos="9360"/>
-        </w:tabs>
-        <w:spacing w:after="0"/>
-        <w:jc w:val="both"/>
-        <w:rPr>
-          <w:rFonts w:ascii="Calibri Light" w:cs="Calibri Light" w:hAnsi="Calibri Light" w:eastAsia="Calibri Light"/>
-          <w:outline w:val="0"/>
-          <w:color w:val="262626"/>
-          <w:sz w:val="20"/>
-          <w:szCs w:val="20"/>
-          <w:u w:color="262626"/>
-          <w14:textFill>
-            <w14:solidFill>
-              <w14:srgbClr w14:val="262626"/>
-            </w14:solidFill>
-          </w14:textFill>
-        </w:rPr>
-      </w:pPr>
-    </w:p>
-    <w:p>
-      <w:pPr>
-        <w:pStyle w:val="Body A"/>
-        <w:tabs>
-          <w:tab w:val="right" w:pos="9916"/>
-        </w:tabs>
-        <w:spacing w:line="252" w:lineRule="auto"/>
-        <w:rPr>
-          <w:rFonts w:ascii="Palatino" w:cs="Palatino" w:hAnsi="Palatino" w:eastAsia="Palatino"/>
-          <w:outline w:val="0"/>
-          <w:color w:val="485970"/>
-          <w:sz w:val="21"/>
-          <w:szCs w:val="21"/>
-          <w:u w:color="485970"/>
-          <w14:textFill>
-            <w14:solidFill>
-              <w14:srgbClr w14:val="485970"/>
-            </w14:solidFill>
-          </w14:textFill>
-        </w:rPr>
-      </w:pPr>
-      <w:r>
-        <w:rPr>
-          <w:rFonts w:ascii="Palatino" w:hAnsi="Palatino"/>
-          <w:b w:val="1"/>
-          <w:bCs w:val="1"/>
-          <w:outline w:val="0"/>
-          <w:color w:val="485970"/>
-          <w:sz w:val="21"/>
-          <w:szCs w:val="21"/>
-          <w:u w:color="485970"/>
-          <w:rtl w:val="0"/>
-          <w:lang w:val="en-US"/>
-          <w14:textFill>
-            <w14:solidFill>
-              <w14:srgbClr w14:val="485970"/>
-            </w14:solidFill>
-          </w14:textFill>
-        </w:rPr>
-        <w:t xml:space="preserve">Revium</w:t>
-      </w:r>
-      <w:r>
-        <w:rPr>
-          <w:rFonts w:ascii="Palatino" w:hAnsi="Palatino"/>
-          <w:outline w:val="0"/>
-          <w:color w:val="485970"/>
-          <w:sz w:val="21"/>
-          <w:szCs w:val="21"/>
-          <w:u w:color="485970"/>
-          <w:rtl w:val="0"/>
-          <w:lang w:val="en-US"/>
-          <w14:textFill>
-            <w14:solidFill>
-              <w14:srgbClr w14:val="485970"/>
-            </w14:solidFill>
-          </w14:textFill>
-        </w:rPr>
-        <w:t xml:space="preserve">, Melbourne, Australia </w:t>
-      </w:r>
-      <w:r>
-        <w:rPr>
-          <w:rFonts w:ascii="Palatino" w:hAnsi="Palatino" w:hint="default"/>
-          <w:outline w:val="0"/>
-          <w:color w:val="485970"/>
-          <w:sz w:val="21"/>
-          <w:szCs w:val="21"/>
-          <w:u w:color="485970"/>
-          <w:rtl w:val="0"/>
-          <w:lang w:val="en-US"/>
-          <w14:textFill>
-            <w14:solidFill>
-              <w14:srgbClr w14:val="485970"/>
-            </w14:solidFill>
-          </w14:textFill>
-        </w:rPr>
-        <w:t xml:space="preserve">• </w:t>
-      </w:r>
-      <w:r>
-        <w:rPr>
-          <w:rFonts w:ascii="Palatino" w:hAnsi="Palatino"/>
-          <w:outline w:val="0"/>
-          <w:color w:val="485970"/>
-          <w:sz w:val="21"/>
-          <w:szCs w:val="21"/>
-          <w:u w:color="485970"/>
-          <w:rtl w:val="0"/>
-          <w:lang w:val="en-US"/>
-          <w14:textFill>
-            <w14:solidFill>
-              <w14:srgbClr w14:val="485970"/>
-            </w14:solidFill>
-          </w14:textFill>
-        </w:rPr>
-        <w:t xml:space="preserve">Web Developer</w:t>
+        <w:t xml:space="preserve">Senior Engineer</w:t>
       </w:r>
       <w:r>
         <w:rPr>
@@ -5385,7 +5653,7 @@
             </w14:solidFill>
           </w14:textFill>
         </w:rPr>
-        <w:t xml:space="preserve"> (Performing Arts) </w:t>
+        <w:t xml:space="preserve"> (Introduction to Long Form Improvisational Comedy) </w:t>
       </w:r>
       <w:r>
         <w:rPr>
@@ -5482,7 +5750,104 @@
             </w14:solidFill>
           </w14:textFill>
         </w:rPr>
-        <w:t xml:space="preserve"> (Hospitality) </w:t>
+        <w:t xml:space="preserve"> (Professional Scrum Master Level 1) </w:t>
+      </w:r>
+      <w:r>
+        <w:rPr>
+          <w:rFonts w:ascii="Palatino" w:hAnsi="Palatino" w:hint="default"/>
+          <w:outline w:val="0"/>
+          <w:color w:val="485970"/>
+          <w:sz w:val="21"/>
+          <w:szCs w:val="21"/>
+          <w:u w:color="485970"/>
+          <w:rtl w:val="0"/>
+          <w:lang w:val="en-US"/>
+          <w14:textFill>
+            <w14:solidFill>
+              <w14:srgbClr w14:val="485970"/>
+            </w14:solidFill>
+          </w14:textFill>
+        </w:rPr>
+        <w:t xml:space="preserve">•</w:t>
+      </w:r>
+      <w:r>
+        <w:rPr>
+          <w:rFonts w:ascii="Palatino" w:hAnsi="Palatino"/>
+          <w:outline w:val="0"/>
+          <w:color w:val="485970"/>
+          <w:sz w:val="21"/>
+          <w:szCs w:val="21"/>
+          <w:u w:color="485970"/>
+          <w:rtl w:val="0"/>
+          <w:lang w:val="en-US"/>
+          <w14:textFill>
+            <w14:solidFill>
+              <w14:srgbClr w14:val="485970"/>
+            </w14:solidFill>
+          </w14:textFill>
+        </w:rPr>
+        <w:t xml:space="preserve">elabor8, Melbourne, Australia</w:t>
+        <w:tab/>
+        <w:t xml:space="preserve">(2016)</w:t>
+      </w:r>
+    </w:p>
+    <w:p>
+      <w:pPr>
+        <w:pStyle w:val="Body A"/>
+        <w:tabs>
+          <w:tab w:val="right" w:pos="9916"/>
+        </w:tabs>
+        <w:spacing w:line="240" w:lineRule="auto"/>
+        <w:rPr>
+          <w:rFonts w:ascii="Palatino" w:cs="Palatino" w:hAnsi="Palatino" w:eastAsia="Palatino"/>
+          <w:i w:val="1"/>
+          <w:iCs w:val="1"/>
+          <w:outline w:val="0"/>
+          <w:color w:val="485970"/>
+          <w:sz w:val="21"/>
+          <w:szCs w:val="21"/>
+          <w:u w:color="485970"/>
+          <w14:textFill>
+            <w14:solidFill>
+              <w14:srgbClr w14:val="485970"/>
+            </w14:solidFill>
+          </w14:textFill>
+        </w:rPr>
+      </w:pPr>
+      <w:r>
+        <w:rPr>
+          <w:rFonts w:ascii="Palatino" w:hAnsi="Palatino"/>
+          <w:outline w:val="0"/>
+          <w:color w:val="525252"/>
+          <w:rtl w:val="0"/>
+          <w:lang w:val="en-US"/>
+          <w14:textFill>
+            <w14:solidFill>
+              <w14:srgbClr w14:val="535353"/>
+            </w14:solidFill>
+          </w14:textFill>
+        </w:rPr>
+        <w:t xml:space="preserve">Certificate</w:t>
+      </w:r>
+      <w:r>
+        <w:rPr>
+          <w:rFonts w:ascii="Palatino" w:hAnsi="Palatino"/>
+          <w:b w:val="1"/>
+          <w:bCs w:val="1"/>
+          <w:outline w:val="0"/>
+          <w:color w:val="525252"/>
+          <w:sz w:val="21"/>
+          <w:szCs w:val="21"/>
+          <w:u w:color="485970"/>
+          <w:rtl w:val="0"/>
+          <w:lang w:val="en-US"/>
+          <w14:textFill>
+            <w14:solidFill>
+              <w14:srgbClr w14:val="535353"/>
+            </w14:solidFill>
+          </w14:textFill>
+        </w:rPr>
+        <w:t xml:space="preserve"> (Barista Coffee Course) </w:t>
       </w:r>
       <w:r>
         <w:rPr>

</xml_diff>

<commit_message>
update JSON and rebuild msword doc
</commit_message>
<xml_diff>
--- a/resume/build/resume.clintp.docx
+++ b/resume/build/resume.clintp.docx
@@ -491,7 +491,7 @@
           </w14:textFill>
         </w:rPr>
         <w:tab/>
-        <w:t xml:space="preserve">2024-07-31 - undefined</w:t>
+        <w:t xml:space="preserve">2024-07-31 - 2026-03-10</w:t>
       </w:r>
     </w:p>
     <w:p>
@@ -532,7 +532,7 @@
             </w14:solidFill>
           </w14:textFill>
         </w:rPr>
-        <w:t/>
+        <w:t xml:space="preserve">Ruby/Rails, Python, React, Typescript, Kotlin, Kubernetes, Amazon Bedrock</w:t>
       </w:r>
     </w:p>
     <w:p>

</xml_diff>